<commit_message>
feat: update the doc
Signed-off-by: ZhenyuWangs <wzy@calypso.cn>
</commit_message>
<xml_diff>
--- a/deliverables/LLM中文文本生成系统V1.0用户操作手册.docx
+++ b/deliverables/LLM中文文本生成系统V1.0用户操作手册.docx
@@ -638,7 +638,7 @@
           <w:color w:val="000000"/>
           <w:sz w:val="21"/>
         </w:rPr>
-        <w:t>11 常见问题与故障处理</w:t>
+        <w:t>11 一键功能测试</w:t>
       </w:r>
     </w:p>
     <w:p>
@@ -652,7 +652,7 @@
           <w:color w:val="000000"/>
           <w:sz w:val="21"/>
         </w:rPr>
-        <w:t>12 数据安全与使用边界</w:t>
+        <w:t>12 Notebook 分批测试</w:t>
       </w:r>
     </w:p>
     <w:p>
@@ -666,7 +666,63 @@
           <w:color w:val="000000"/>
           <w:sz w:val="21"/>
         </w:rPr>
-        <w:t>13 软件卸载</w:t>
+        <w:t>13 常见问题与故障处理</w:t>
+      </w:r>
+    </w:p>
+    <w:p>
+      <w:pPr>
+        <w:pStyle w:val="ListBullet"/>
+        <w:ind w:left="454"/>
+      </w:pPr>
+      <w:r>
+        <w:rPr>
+          <w:rFonts w:ascii="Arial" w:hAnsi="Arial" w:eastAsia="宋体"/>
+          <w:color w:val="000000"/>
+          <w:sz w:val="21"/>
+        </w:rPr>
+        <w:t>14 数据安全与使用边界</w:t>
+      </w:r>
+    </w:p>
+    <w:p>
+      <w:pPr>
+        <w:pStyle w:val="ListBullet"/>
+        <w:ind w:left="454"/>
+      </w:pPr>
+      <w:r>
+        <w:rPr>
+          <w:rFonts w:ascii="Arial" w:hAnsi="Arial" w:eastAsia="宋体"/>
+          <w:color w:val="000000"/>
+          <w:sz w:val="21"/>
+        </w:rPr>
+        <w:t>15 日常维护与卸载</w:t>
+      </w:r>
+    </w:p>
+    <w:p>
+      <w:pPr>
+        <w:pStyle w:val="ListBullet"/>
+        <w:ind w:left="454"/>
+      </w:pPr>
+      <w:r>
+        <w:rPr>
+          <w:rFonts w:ascii="Arial" w:hAnsi="Arial" w:eastAsia="宋体"/>
+          <w:color w:val="000000"/>
+          <w:sz w:val="21"/>
+        </w:rPr>
+        <w:t>附录 A 命令速查</w:t>
+      </w:r>
+    </w:p>
+    <w:p>
+      <w:pPr>
+        <w:pStyle w:val="ListBullet"/>
+        <w:ind w:left="454"/>
+      </w:pPr>
+      <w:r>
+        <w:rPr>
+          <w:rFonts w:ascii="Arial" w:hAnsi="Arial" w:eastAsia="宋体"/>
+          <w:color w:val="000000"/>
+          <w:sz w:val="21"/>
+        </w:rPr>
+        <w:t>附录 B 验收检查表</w:t>
       </w:r>
     </w:p>
     <w:p>
@@ -1423,6 +1479,375 @@
         <w:t>python -m pip install -e ".[llm]"</w:t>
       </w:r>
     </w:p>
+    <w:p>
+      <w:pPr>
+        <w:pStyle w:val="Heading2"/>
+        <w:keepNext/>
+      </w:pPr>
+      <w:r>
+        <w:t>2.4 Linux GPU 环境检查</w:t>
+      </w:r>
+    </w:p>
+    <w:p>
+      <w:pPr>
+        <w:ind w:firstLine="420"/>
+      </w:pPr>
+      <w:r>
+        <w:rPr>
+          <w:rFonts w:ascii="Arial" w:hAnsi="Arial" w:eastAsia="宋体"/>
+          <w:color w:val="000000"/>
+          <w:sz w:val="21"/>
+        </w:rPr>
+        <w:t>在加载模型前，应确认驱动、PyTorch 和 CUDA 运行时能够协同工作。显卡驱动显示的 CUDA Version 表示驱动可支持的最高 CUDA 版本，不等同于当前 PyTorch 的编译版本。以下命令用于核对设备状态。</w:t>
+      </w:r>
+    </w:p>
+    <w:p>
+      <w:pPr>
+        <w:spacing w:after="0" w:line="240" w:lineRule="auto"/>
+        <w:ind w:left="454"/>
+      </w:pPr>
+      <w:r>
+        <w:rPr>
+          <w:rFonts w:ascii="Consolas" w:hAnsi="Consolas" w:eastAsia="等线"/>
+          <w:color w:val="000000"/>
+          <w:sz w:val="18"/>
+        </w:rPr>
+        <w:t>nvidia-smi</w:t>
+      </w:r>
+    </w:p>
+    <w:p>
+      <w:pPr>
+        <w:spacing w:after="0" w:line="240" w:lineRule="auto"/>
+        <w:ind w:left="454"/>
+      </w:pPr>
+      <w:r>
+        <w:rPr>
+          <w:rFonts w:ascii="Consolas" w:hAnsi="Consolas" w:eastAsia="等线"/>
+          <w:color w:val="000000"/>
+          <w:sz w:val="18"/>
+        </w:rPr>
+        <w:t>python -c "import torch; print(torch.__version__); print(torch.version.cuda); print(torch.cuda.is_available()); print(torch.cuda.get_device_name(0))"</w:t>
+      </w:r>
+    </w:p>
+    <w:p>
+      <w:pPr>
+        <w:ind w:firstLine="420"/>
+      </w:pPr>
+      <w:r>
+        <w:rPr>
+          <w:rFonts w:ascii="Arial" w:hAnsi="Arial" w:eastAsia="宋体"/>
+          <w:color w:val="000000"/>
+          <w:sz w:val="21"/>
+        </w:rPr>
+        <w:t>输出中的 torch.cuda.is_available() 应为 True，并能显示显卡名称。若服务器拥有多张卡，可在命令前设置 CUDA_VISIBLE_DEVICES=0，只向当前进程暴露一张物理卡。此时程序内部仍使用 cuda:0。</w:t>
+      </w:r>
+    </w:p>
+    <w:p>
+      <w:pPr>
+        <w:pStyle w:val="Heading2"/>
+        <w:keepNext/>
+      </w:pPr>
+      <w:r>
+        <w:t>2.5 Linux 预设部署路径</w:t>
+      </w:r>
+    </w:p>
+    <w:p>
+      <w:pPr>
+        <w:ind w:firstLine="420"/>
+      </w:pPr>
+      <w:r>
+        <w:rPr>
+          <w:rFonts w:ascii="Arial" w:hAnsi="Arial" w:eastAsia="宋体"/>
+          <w:color w:val="000000"/>
+          <w:sz w:val="21"/>
+        </w:rPr>
+        <w:t>配套测试脚本默认使用下列部署路径。路径不一致时，可以通过脚本参数覆盖，也可以在 Notebook 的初始化单元中修改。</w:t>
+      </w:r>
+    </w:p>
+    <w:tbl>
+      <w:tblPr>
+        <w:tblStyle w:val="TableGrid"/>
+        <w:tblW w:type="auto" w:w="0"/>
+        <w:jc w:val="center"/>
+        <w:tblLook w:firstColumn="1" w:firstRow="1" w:lastColumn="0" w:lastRow="0" w:noHBand="0" w:noVBand="1" w:val="04A0"/>
+      </w:tblPr>
+      <w:tblGrid>
+        <w:gridCol w:w="4702"/>
+        <w:gridCol w:w="4702"/>
+      </w:tblGrid>
+      <w:tr>
+        <w:trPr>
+          <w:tblHeader/>
+        </w:trPr>
+        <w:tc>
+          <w:tcPr>
+            <w:tcW w:type="dxa" w:w="2268"/>
+            <w:shd w:fill="1F4E78"/>
+            <w:vAlign w:val="center"/>
+            <w:tcMar>
+              <w:top w:w="100" w:type="dxa"/>
+              <w:start w:w="120" w:type="dxa"/>
+              <w:bottom w:w="100" w:type="dxa"/>
+              <w:end w:w="120" w:type="dxa"/>
+            </w:tcMar>
+          </w:tcPr>
+          <w:p>
+            <w:pPr>
+              <w:jc w:val="center"/>
+            </w:pPr>
+            <w:r>
+              <w:rPr>
+                <w:rFonts w:ascii="Arial" w:hAnsi="Arial" w:eastAsia="黑体"/>
+                <w:b/>
+                <w:color w:val="FFFFFF"/>
+                <w:sz w:val="19"/>
+              </w:rPr>
+              <w:t>用途</w:t>
+            </w:r>
+          </w:p>
+        </w:tc>
+        <w:tc>
+          <w:tcPr>
+            <w:tcW w:type="dxa" w:w="6633"/>
+            <w:shd w:fill="1F4E78"/>
+            <w:vAlign w:val="center"/>
+            <w:tcMar>
+              <w:top w:w="100" w:type="dxa"/>
+              <w:start w:w="120" w:type="dxa"/>
+              <w:bottom w:w="100" w:type="dxa"/>
+              <w:end w:w="120" w:type="dxa"/>
+            </w:tcMar>
+          </w:tcPr>
+          <w:p>
+            <w:pPr>
+              <w:jc w:val="center"/>
+            </w:pPr>
+            <w:r>
+              <w:rPr>
+                <w:rFonts w:ascii="Arial" w:hAnsi="Arial" w:eastAsia="黑体"/>
+                <w:b/>
+                <w:color w:val="FFFFFF"/>
+                <w:sz w:val="19"/>
+              </w:rPr>
+              <w:t>预设路径</w:t>
+            </w:r>
+          </w:p>
+        </w:tc>
+      </w:tr>
+      <w:tr>
+        <w:tc>
+          <w:tcPr>
+            <w:tcW w:type="dxa" w:w="2268"/>
+            <w:vAlign w:val="center"/>
+            <w:tcMar>
+              <w:top w:w="100" w:type="dxa"/>
+              <w:start w:w="120" w:type="dxa"/>
+              <w:bottom w:w="100" w:type="dxa"/>
+              <w:end w:w="120" w:type="dxa"/>
+            </w:tcMar>
+          </w:tcPr>
+          <w:p>
+            <w:pPr>
+              <w:jc w:val="center"/>
+            </w:pPr>
+            <w:r>
+              <w:rPr>
+                <w:rFonts w:ascii="Arial" w:hAnsi="Arial" w:eastAsia="宋体"/>
+                <w:color w:val="000000"/>
+                <w:sz w:val="18"/>
+              </w:rPr>
+              <w:t>软件目录</w:t>
+            </w:r>
+          </w:p>
+        </w:tc>
+        <w:tc>
+          <w:tcPr>
+            <w:tcW w:type="dxa" w:w="6633"/>
+            <w:vAlign w:val="center"/>
+            <w:tcMar>
+              <w:top w:w="100" w:type="dxa"/>
+              <w:start w:w="120" w:type="dxa"/>
+              <w:bottom w:w="100" w:type="dxa"/>
+              <w:end w:w="120" w:type="dxa"/>
+            </w:tcMar>
+          </w:tcPr>
+          <w:p>
+            <w:pPr>
+              <w:jc w:val="left"/>
+            </w:pPr>
+            <w:r>
+              <w:rPr>
+                <w:rFonts w:ascii="Arial" w:hAnsi="Arial" w:eastAsia="宋体"/>
+                <w:color w:val="000000"/>
+                <w:sz w:val="18"/>
+              </w:rPr>
+              <w:t>/home/wangzy/workplace/wyc/llmctg</w:t>
+            </w:r>
+          </w:p>
+        </w:tc>
+      </w:tr>
+      <w:tr>
+        <w:tc>
+          <w:tcPr>
+            <w:tcW w:type="dxa" w:w="2268"/>
+            <w:shd w:fill="F2F6FA"/>
+            <w:vAlign w:val="center"/>
+            <w:tcMar>
+              <w:top w:w="100" w:type="dxa"/>
+              <w:start w:w="120" w:type="dxa"/>
+              <w:bottom w:w="100" w:type="dxa"/>
+              <w:end w:w="120" w:type="dxa"/>
+            </w:tcMar>
+          </w:tcPr>
+          <w:p>
+            <w:pPr>
+              <w:jc w:val="center"/>
+            </w:pPr>
+            <w:r>
+              <w:rPr>
+                <w:rFonts w:ascii="Arial" w:hAnsi="Arial" w:eastAsia="宋体"/>
+                <w:color w:val="000000"/>
+                <w:sz w:val="18"/>
+              </w:rPr>
+              <w:t>基础模型</w:t>
+            </w:r>
+          </w:p>
+        </w:tc>
+        <w:tc>
+          <w:tcPr>
+            <w:tcW w:type="dxa" w:w="6633"/>
+            <w:shd w:fill="F2F6FA"/>
+            <w:vAlign w:val="center"/>
+            <w:tcMar>
+              <w:top w:w="100" w:type="dxa"/>
+              <w:start w:w="120" w:type="dxa"/>
+              <w:bottom w:w="100" w:type="dxa"/>
+              <w:end w:w="120" w:type="dxa"/>
+            </w:tcMar>
+          </w:tcPr>
+          <w:p>
+            <w:pPr>
+              <w:jc w:val="left"/>
+            </w:pPr>
+            <w:r>
+              <w:rPr>
+                <w:rFonts w:ascii="Arial" w:hAnsi="Arial" w:eastAsia="宋体"/>
+                <w:color w:val="000000"/>
+                <w:sz w:val="18"/>
+              </w:rPr>
+              <w:t>/home/wangzy/workplace/wyc/Qwen3-1.7B</w:t>
+            </w:r>
+          </w:p>
+        </w:tc>
+      </w:tr>
+      <w:tr>
+        <w:tc>
+          <w:tcPr>
+            <w:tcW w:type="dxa" w:w="2268"/>
+            <w:vAlign w:val="center"/>
+            <w:tcMar>
+              <w:top w:w="100" w:type="dxa"/>
+              <w:start w:w="120" w:type="dxa"/>
+              <w:bottom w:w="100" w:type="dxa"/>
+              <w:end w:w="120" w:type="dxa"/>
+            </w:tcMar>
+          </w:tcPr>
+          <w:p>
+            <w:pPr>
+              <w:jc w:val="center"/>
+            </w:pPr>
+            <w:r>
+              <w:rPr>
+                <w:rFonts w:ascii="Arial" w:hAnsi="Arial" w:eastAsia="宋体"/>
+                <w:color w:val="000000"/>
+                <w:sz w:val="18"/>
+              </w:rPr>
+              <w:t>训练样本</w:t>
+            </w:r>
+          </w:p>
+        </w:tc>
+        <w:tc>
+          <w:tcPr>
+            <w:tcW w:type="dxa" w:w="6633"/>
+            <w:vAlign w:val="center"/>
+            <w:tcMar>
+              <w:top w:w="100" w:type="dxa"/>
+              <w:start w:w="120" w:type="dxa"/>
+              <w:bottom w:w="100" w:type="dxa"/>
+              <w:end w:w="120" w:type="dxa"/>
+            </w:tcMar>
+          </w:tcPr>
+          <w:p>
+            <w:pPr>
+              <w:jc w:val="left"/>
+            </w:pPr>
+            <w:r>
+              <w:rPr>
+                <w:rFonts w:ascii="Arial" w:hAnsi="Arial" w:eastAsia="宋体"/>
+                <w:color w:val="000000"/>
+                <w:sz w:val="18"/>
+              </w:rPr>
+              <w:t>test_data/llmctg_smoke_train.txt</w:t>
+            </w:r>
+          </w:p>
+        </w:tc>
+      </w:tr>
+      <w:tr>
+        <w:tc>
+          <w:tcPr>
+            <w:tcW w:type="dxa" w:w="2268"/>
+            <w:shd w:fill="F2F6FA"/>
+            <w:vAlign w:val="center"/>
+            <w:tcMar>
+              <w:top w:w="100" w:type="dxa"/>
+              <w:start w:w="120" w:type="dxa"/>
+              <w:bottom w:w="100" w:type="dxa"/>
+              <w:end w:w="120" w:type="dxa"/>
+            </w:tcMar>
+          </w:tcPr>
+          <w:p>
+            <w:pPr>
+              <w:jc w:val="center"/>
+            </w:pPr>
+            <w:r>
+              <w:rPr>
+                <w:rFonts w:ascii="Arial" w:hAnsi="Arial" w:eastAsia="宋体"/>
+                <w:color w:val="000000"/>
+                <w:sz w:val="18"/>
+              </w:rPr>
+              <w:t>测试输出</w:t>
+            </w:r>
+          </w:p>
+        </w:tc>
+        <w:tc>
+          <w:tcPr>
+            <w:tcW w:type="dxa" w:w="6633"/>
+            <w:shd w:fill="F2F6FA"/>
+            <w:vAlign w:val="center"/>
+            <w:tcMar>
+              <w:top w:w="100" w:type="dxa"/>
+              <w:start w:w="120" w:type="dxa"/>
+              <w:bottom w:w="100" w:type="dxa"/>
+              <w:end w:w="120" w:type="dxa"/>
+            </w:tcMar>
+          </w:tcPr>
+          <w:p>
+            <w:pPr>
+              <w:jc w:val="left"/>
+            </w:pPr>
+            <w:r>
+              <w:rPr>
+                <w:rFonts w:ascii="Arial" w:hAnsi="Arial" w:eastAsia="宋体"/>
+                <w:color w:val="000000"/>
+                <w:sz w:val="18"/>
+              </w:rPr>
+              <w:t>test_output/时间戳目录</w:t>
+            </w:r>
+          </w:p>
+        </w:tc>
+      </w:tr>
+    </w:tbl>
+    <w:p/>
     <w:p>
       <w:pPr>
         <w:pStyle w:val="Heading1"/>
@@ -2541,6 +2966,775 @@
     </w:p>
     <w:p>
       <w:pPr>
+        <w:pStyle w:val="Heading2"/>
+        <w:keepNext/>
+      </w:pPr>
+      <w:r>
+        <w:t>4.3 加载 LoRA 适配器生成</w:t>
+      </w:r>
+    </w:p>
+    <w:p>
+      <w:pPr>
+        <w:ind w:firstLine="420"/>
+      </w:pPr>
+      <w:r>
+        <w:rPr>
+          <w:rFonts w:ascii="Arial" w:hAnsi="Arial" w:eastAsia="宋体"/>
+          <w:color w:val="000000"/>
+          <w:sz w:val="21"/>
+        </w:rPr>
+        <w:t>微调完成后，使用 --lora-path 指向包含 adapter_config.json 和 adapter_model.safetensors 的适配器目录。系统先加载基础模型，再以只读推理方式挂载适配器。基础模型必须与训练该适配器时使用的模型一致。</w:t>
+      </w:r>
+    </w:p>
+    <w:p>
+      <w:pPr>
+        <w:spacing w:after="0" w:line="240" w:lineRule="auto"/>
+        <w:ind w:left="454"/>
+      </w:pPr>
+      <w:r>
+        <w:rPr>
+          <w:rFonts w:ascii="Consolas" w:hAnsi="Consolas" w:eastAsia="等线"/>
+          <w:color w:val="000000"/>
+          <w:sz w:val="18"/>
+        </w:rPr>
+        <w:t>CUDA_VISIBLE_DEVICES=0 llmctg generate \</w:t>
+      </w:r>
+    </w:p>
+    <w:p>
+      <w:pPr>
+        <w:spacing w:after="0" w:line="240" w:lineRule="auto"/>
+        <w:ind w:left="454"/>
+      </w:pPr>
+      <w:r>
+        <w:rPr>
+          <w:rFonts w:ascii="Consolas" w:hAnsi="Consolas" w:eastAsia="等线"/>
+          <w:color w:val="000000"/>
+          <w:sz w:val="18"/>
+        </w:rPr>
+        <w:t xml:space="preserve">  --backend transformers \</w:t>
+      </w:r>
+    </w:p>
+    <w:p>
+      <w:pPr>
+        <w:spacing w:after="0" w:line="240" w:lineRule="auto"/>
+        <w:ind w:left="454"/>
+      </w:pPr>
+      <w:r>
+        <w:rPr>
+          <w:rFonts w:ascii="Consolas" w:hAnsi="Consolas" w:eastAsia="等线"/>
+          <w:color w:val="000000"/>
+          <w:sz w:val="18"/>
+        </w:rPr>
+        <w:t xml:space="preserve">  --model-path /home/wangzy/workplace/wyc/Qwen3-1.7B \</w:t>
+      </w:r>
+    </w:p>
+    <w:p>
+      <w:pPr>
+        <w:spacing w:after="0" w:line="240" w:lineRule="auto"/>
+        <w:ind w:left="454"/>
+      </w:pPr>
+      <w:r>
+        <w:rPr>
+          <w:rFonts w:ascii="Consolas" w:hAnsi="Consolas" w:eastAsia="等线"/>
+          <w:color w:val="000000"/>
+          <w:sz w:val="18"/>
+        </w:rPr>
+        <w:t xml:space="preserve">  --lora-path test_output/qwen3-1.7b-lora-smoke \</w:t>
+      </w:r>
+    </w:p>
+    <w:p>
+      <w:pPr>
+        <w:spacing w:after="0" w:line="240" w:lineRule="auto"/>
+        <w:ind w:left="454"/>
+      </w:pPr>
+      <w:r>
+        <w:rPr>
+          <w:rFonts w:ascii="Consolas" w:hAnsi="Consolas" w:eastAsia="等线"/>
+          <w:color w:val="000000"/>
+          <w:sz w:val="18"/>
+        </w:rPr>
+        <w:t xml:space="preserve">  --device cuda:0 \</w:t>
+      </w:r>
+    </w:p>
+    <w:p>
+      <w:pPr>
+        <w:spacing w:after="0" w:line="240" w:lineRule="auto"/>
+        <w:ind w:left="454"/>
+      </w:pPr>
+      <w:r>
+        <w:rPr>
+          <w:rFonts w:ascii="Consolas" w:hAnsi="Consolas" w:eastAsia="等线"/>
+          <w:color w:val="000000"/>
+          <w:sz w:val="18"/>
+        </w:rPr>
+        <w:t xml:space="preserve">  --topic "城市河流与生态保护" \</w:t>
+      </w:r>
+    </w:p>
+    <w:p>
+      <w:pPr>
+        <w:spacing w:after="0" w:line="240" w:lineRule="auto"/>
+        <w:ind w:left="454"/>
+      </w:pPr>
+      <w:r>
+        <w:rPr>
+          <w:rFonts w:ascii="Consolas" w:hAnsi="Consolas" w:eastAsia="等线"/>
+          <w:color w:val="000000"/>
+          <w:sz w:val="18"/>
+        </w:rPr>
+        <w:t xml:space="preserve">  --level junior \</w:t>
+      </w:r>
+    </w:p>
+    <w:p>
+      <w:pPr>
+        <w:spacing w:after="0" w:line="240" w:lineRule="auto"/>
+        <w:ind w:left="454"/>
+      </w:pPr>
+      <w:r>
+        <w:rPr>
+          <w:rFonts w:ascii="Consolas" w:hAnsi="Consolas" w:eastAsia="等线"/>
+          <w:color w:val="000000"/>
+          <w:sz w:val="18"/>
+        </w:rPr>
+        <w:t xml:space="preserve">  --instruction "说明生态价值、污染来源和保护方法" \</w:t>
+      </w:r>
+    </w:p>
+    <w:p>
+      <w:pPr>
+        <w:spacing w:after="0" w:line="240" w:lineRule="auto"/>
+        <w:ind w:left="454"/>
+      </w:pPr>
+      <w:r>
+        <w:rPr>
+          <w:rFonts w:ascii="Consolas" w:hAnsi="Consolas" w:eastAsia="等线"/>
+          <w:color w:val="000000"/>
+          <w:sz w:val="18"/>
+        </w:rPr>
+        <w:t xml:space="preserve">  --keywords "河流,生态,污染,保护" \</w:t>
+      </w:r>
+    </w:p>
+    <w:p>
+      <w:pPr>
+        <w:spacing w:after="0" w:line="240" w:lineRule="auto"/>
+        <w:ind w:left="454"/>
+      </w:pPr>
+      <w:r>
+        <w:rPr>
+          <w:rFonts w:ascii="Consolas" w:hAnsi="Consolas" w:eastAsia="等线"/>
+          <w:color w:val="000000"/>
+          <w:sz w:val="18"/>
+        </w:rPr>
+        <w:t xml:space="preserve">  --count 1 --seed 2026 \</w:t>
+      </w:r>
+    </w:p>
+    <w:p>
+      <w:pPr>
+        <w:spacing w:after="0" w:line="240" w:lineRule="auto"/>
+        <w:ind w:left="454"/>
+      </w:pPr>
+      <w:r>
+        <w:rPr>
+          <w:rFonts w:ascii="Consolas" w:hAnsi="Consolas" w:eastAsia="等线"/>
+          <w:color w:val="000000"/>
+          <w:sz w:val="18"/>
+        </w:rPr>
+        <w:t xml:space="preserve">  --output test_output/qwen3-lora-generation.jsonl</w:t>
+      </w:r>
+    </w:p>
+    <w:p>
+      <w:pPr>
+        <w:ind w:firstLine="420"/>
+      </w:pPr>
+      <w:r>
+        <w:rPr>
+          <w:rFonts w:ascii="Arial" w:hAnsi="Arial" w:eastAsia="宋体"/>
+          <w:color w:val="000000"/>
+          <w:sz w:val="21"/>
+        </w:rPr>
+        <w:t>命令中的反斜杠只放在 Linux 命令行的行末用于续行。参数名前应写 --，变量名中不要插入反斜杠。例如应写 --model-path 和 $MODEL_PATH，不能写成 \--model-path 或 $MODEL\_PATH。</w:t>
+      </w:r>
+    </w:p>
+    <w:p>
+      <w:pPr>
+        <w:pStyle w:val="Heading2"/>
+        <w:keepNext/>
+      </w:pPr>
+      <w:r>
+        <w:t>4.4 生成参数的影响</w:t>
+      </w:r>
+    </w:p>
+    <w:tbl>
+      <w:tblPr>
+        <w:tblStyle w:val="TableGrid"/>
+        <w:tblW w:type="auto" w:w="0"/>
+        <w:jc w:val="center"/>
+        <w:tblLook w:firstColumn="1" w:firstRow="1" w:lastColumn="0" w:lastRow="0" w:noHBand="0" w:noVBand="1" w:val="04A0"/>
+      </w:tblPr>
+      <w:tblGrid>
+        <w:gridCol w:w="3135"/>
+        <w:gridCol w:w="3135"/>
+        <w:gridCol w:w="3135"/>
+      </w:tblGrid>
+      <w:tr>
+        <w:trPr>
+          <w:tblHeader/>
+        </w:trPr>
+        <w:tc>
+          <w:tcPr>
+            <w:tcW w:type="dxa" w:w="2154"/>
+            <w:shd w:fill="1F4E78"/>
+            <w:vAlign w:val="center"/>
+            <w:tcMar>
+              <w:top w:w="100" w:type="dxa"/>
+              <w:start w:w="120" w:type="dxa"/>
+              <w:bottom w:w="100" w:type="dxa"/>
+              <w:end w:w="120" w:type="dxa"/>
+            </w:tcMar>
+          </w:tcPr>
+          <w:p>
+            <w:pPr>
+              <w:jc w:val="center"/>
+            </w:pPr>
+            <w:r>
+              <w:rPr>
+                <w:rFonts w:ascii="Arial" w:hAnsi="Arial" w:eastAsia="黑体"/>
+                <w:b/>
+                <w:color w:val="FFFFFF"/>
+                <w:sz w:val="19"/>
+              </w:rPr>
+              <w:t>参数</w:t>
+            </w:r>
+          </w:p>
+        </w:tc>
+        <w:tc>
+          <w:tcPr>
+            <w:tcW w:type="dxa" w:w="3005"/>
+            <w:shd w:fill="1F4E78"/>
+            <w:vAlign w:val="center"/>
+            <w:tcMar>
+              <w:top w:w="100" w:type="dxa"/>
+              <w:start w:w="120" w:type="dxa"/>
+              <w:bottom w:w="100" w:type="dxa"/>
+              <w:end w:w="120" w:type="dxa"/>
+            </w:tcMar>
+          </w:tcPr>
+          <w:p>
+            <w:pPr>
+              <w:jc w:val="center"/>
+            </w:pPr>
+            <w:r>
+              <w:rPr>
+                <w:rFonts w:ascii="Arial" w:hAnsi="Arial" w:eastAsia="黑体"/>
+                <w:b/>
+                <w:color w:val="FFFFFF"/>
+                <w:sz w:val="19"/>
+              </w:rPr>
+              <w:t>作用</w:t>
+            </w:r>
+          </w:p>
+        </w:tc>
+        <w:tc>
+          <w:tcPr>
+            <w:tcW w:type="dxa" w:w="3742"/>
+            <w:shd w:fill="1F4E78"/>
+            <w:vAlign w:val="center"/>
+            <w:tcMar>
+              <w:top w:w="100" w:type="dxa"/>
+              <w:start w:w="120" w:type="dxa"/>
+              <w:bottom w:w="100" w:type="dxa"/>
+              <w:end w:w="120" w:type="dxa"/>
+            </w:tcMar>
+          </w:tcPr>
+          <w:p>
+            <w:pPr>
+              <w:jc w:val="center"/>
+            </w:pPr>
+            <w:r>
+              <w:rPr>
+                <w:rFonts w:ascii="Arial" w:hAnsi="Arial" w:eastAsia="黑体"/>
+                <w:b/>
+                <w:color w:val="FFFFFF"/>
+                <w:sz w:val="19"/>
+              </w:rPr>
+              <w:t>使用建议</w:t>
+            </w:r>
+          </w:p>
+        </w:tc>
+      </w:tr>
+      <w:tr>
+        <w:tc>
+          <w:tcPr>
+            <w:tcW w:type="dxa" w:w="2154"/>
+            <w:vAlign w:val="center"/>
+            <w:tcMar>
+              <w:top w:w="100" w:type="dxa"/>
+              <w:start w:w="120" w:type="dxa"/>
+              <w:bottom w:w="100" w:type="dxa"/>
+              <w:end w:w="120" w:type="dxa"/>
+            </w:tcMar>
+          </w:tcPr>
+          <w:p>
+            <w:pPr>
+              <w:jc w:val="center"/>
+            </w:pPr>
+            <w:r>
+              <w:rPr>
+                <w:rFonts w:ascii="Arial" w:hAnsi="Arial" w:eastAsia="宋体"/>
+                <w:color w:val="000000"/>
+                <w:sz w:val="18"/>
+              </w:rPr>
+              <w:t>temperature</w:t>
+            </w:r>
+          </w:p>
+        </w:tc>
+        <w:tc>
+          <w:tcPr>
+            <w:tcW w:type="dxa" w:w="3005"/>
+            <w:vAlign w:val="center"/>
+            <w:tcMar>
+              <w:top w:w="100" w:type="dxa"/>
+              <w:start w:w="120" w:type="dxa"/>
+              <w:bottom w:w="100" w:type="dxa"/>
+              <w:end w:w="120" w:type="dxa"/>
+            </w:tcMar>
+          </w:tcPr>
+          <w:p>
+            <w:pPr>
+              <w:jc w:val="left"/>
+            </w:pPr>
+            <w:r>
+              <w:rPr>
+                <w:rFonts w:ascii="Arial" w:hAnsi="Arial" w:eastAsia="宋体"/>
+                <w:color w:val="000000"/>
+                <w:sz w:val="18"/>
+              </w:rPr>
+              <w:t>控制采样随机性</w:t>
+            </w:r>
+          </w:p>
+        </w:tc>
+        <w:tc>
+          <w:tcPr>
+            <w:tcW w:type="dxa" w:w="3742"/>
+            <w:vAlign w:val="center"/>
+            <w:tcMar>
+              <w:top w:w="100" w:type="dxa"/>
+              <w:start w:w="120" w:type="dxa"/>
+              <w:bottom w:w="100" w:type="dxa"/>
+              <w:end w:w="120" w:type="dxa"/>
+            </w:tcMar>
+          </w:tcPr>
+          <w:p>
+            <w:pPr>
+              <w:jc w:val="left"/>
+            </w:pPr>
+            <w:r>
+              <w:rPr>
+                <w:rFonts w:ascii="Arial" w:hAnsi="Arial" w:eastAsia="宋体"/>
+                <w:color w:val="000000"/>
+                <w:sz w:val="18"/>
+              </w:rPr>
+              <w:t>较低值更稳定，较高值更多样</w:t>
+            </w:r>
+          </w:p>
+        </w:tc>
+      </w:tr>
+      <w:tr>
+        <w:tc>
+          <w:tcPr>
+            <w:tcW w:type="dxa" w:w="2154"/>
+            <w:shd w:fill="F2F6FA"/>
+            <w:vAlign w:val="center"/>
+            <w:tcMar>
+              <w:top w:w="100" w:type="dxa"/>
+              <w:start w:w="120" w:type="dxa"/>
+              <w:bottom w:w="100" w:type="dxa"/>
+              <w:end w:w="120" w:type="dxa"/>
+            </w:tcMar>
+          </w:tcPr>
+          <w:p>
+            <w:pPr>
+              <w:jc w:val="center"/>
+            </w:pPr>
+            <w:r>
+              <w:rPr>
+                <w:rFonts w:ascii="Arial" w:hAnsi="Arial" w:eastAsia="宋体"/>
+                <w:color w:val="000000"/>
+                <w:sz w:val="18"/>
+              </w:rPr>
+              <w:t>top_p</w:t>
+            </w:r>
+          </w:p>
+        </w:tc>
+        <w:tc>
+          <w:tcPr>
+            <w:tcW w:type="dxa" w:w="3005"/>
+            <w:shd w:fill="F2F6FA"/>
+            <w:vAlign w:val="center"/>
+            <w:tcMar>
+              <w:top w:w="100" w:type="dxa"/>
+              <w:start w:w="120" w:type="dxa"/>
+              <w:bottom w:w="100" w:type="dxa"/>
+              <w:end w:w="120" w:type="dxa"/>
+            </w:tcMar>
+          </w:tcPr>
+          <w:p>
+            <w:pPr>
+              <w:jc w:val="left"/>
+            </w:pPr>
+            <w:r>
+              <w:rPr>
+                <w:rFonts w:ascii="Arial" w:hAnsi="Arial" w:eastAsia="宋体"/>
+                <w:color w:val="000000"/>
+                <w:sz w:val="18"/>
+              </w:rPr>
+              <w:t>限制累计概率范围</w:t>
+            </w:r>
+          </w:p>
+        </w:tc>
+        <w:tc>
+          <w:tcPr>
+            <w:tcW w:type="dxa" w:w="3742"/>
+            <w:shd w:fill="F2F6FA"/>
+            <w:vAlign w:val="center"/>
+            <w:tcMar>
+              <w:top w:w="100" w:type="dxa"/>
+              <w:start w:w="120" w:type="dxa"/>
+              <w:bottom w:w="100" w:type="dxa"/>
+              <w:end w:w="120" w:type="dxa"/>
+            </w:tcMar>
+          </w:tcPr>
+          <w:p>
+            <w:pPr>
+              <w:jc w:val="left"/>
+            </w:pPr>
+            <w:r>
+              <w:rPr>
+                <w:rFonts w:ascii="Arial" w:hAnsi="Arial" w:eastAsia="宋体"/>
+                <w:color w:val="000000"/>
+                <w:sz w:val="18"/>
+              </w:rPr>
+              <w:t>通常与 temperature 配合使用</w:t>
+            </w:r>
+          </w:p>
+        </w:tc>
+      </w:tr>
+      <w:tr>
+        <w:tc>
+          <w:tcPr>
+            <w:tcW w:type="dxa" w:w="2154"/>
+            <w:vAlign w:val="center"/>
+            <w:tcMar>
+              <w:top w:w="100" w:type="dxa"/>
+              <w:start w:w="120" w:type="dxa"/>
+              <w:bottom w:w="100" w:type="dxa"/>
+              <w:end w:w="120" w:type="dxa"/>
+            </w:tcMar>
+          </w:tcPr>
+          <w:p>
+            <w:pPr>
+              <w:jc w:val="center"/>
+            </w:pPr>
+            <w:r>
+              <w:rPr>
+                <w:rFonts w:ascii="Arial" w:hAnsi="Arial" w:eastAsia="宋体"/>
+                <w:color w:val="000000"/>
+                <w:sz w:val="18"/>
+              </w:rPr>
+              <w:t>top_k</w:t>
+            </w:r>
+          </w:p>
+        </w:tc>
+        <w:tc>
+          <w:tcPr>
+            <w:tcW w:type="dxa" w:w="3005"/>
+            <w:vAlign w:val="center"/>
+            <w:tcMar>
+              <w:top w:w="100" w:type="dxa"/>
+              <w:start w:w="120" w:type="dxa"/>
+              <w:bottom w:w="100" w:type="dxa"/>
+              <w:end w:w="120" w:type="dxa"/>
+            </w:tcMar>
+          </w:tcPr>
+          <w:p>
+            <w:pPr>
+              <w:jc w:val="left"/>
+            </w:pPr>
+            <w:r>
+              <w:rPr>
+                <w:rFonts w:ascii="Arial" w:hAnsi="Arial" w:eastAsia="宋体"/>
+                <w:color w:val="000000"/>
+                <w:sz w:val="18"/>
+              </w:rPr>
+              <w:t>限制候选词数量</w:t>
+            </w:r>
+          </w:p>
+        </w:tc>
+        <w:tc>
+          <w:tcPr>
+            <w:tcW w:type="dxa" w:w="3742"/>
+            <w:vAlign w:val="center"/>
+            <w:tcMar>
+              <w:top w:w="100" w:type="dxa"/>
+              <w:start w:w="120" w:type="dxa"/>
+              <w:bottom w:w="100" w:type="dxa"/>
+              <w:end w:w="120" w:type="dxa"/>
+            </w:tcMar>
+          </w:tcPr>
+          <w:p>
+            <w:pPr>
+              <w:jc w:val="left"/>
+            </w:pPr>
+            <w:r>
+              <w:rPr>
+                <w:rFonts w:ascii="Arial" w:hAnsi="Arial" w:eastAsia="宋体"/>
+                <w:color w:val="000000"/>
+                <w:sz w:val="18"/>
+              </w:rPr>
+              <w:t>过小可能使表达单一</w:t>
+            </w:r>
+          </w:p>
+        </w:tc>
+      </w:tr>
+      <w:tr>
+        <w:tc>
+          <w:tcPr>
+            <w:tcW w:type="dxa" w:w="2154"/>
+            <w:shd w:fill="F2F6FA"/>
+            <w:vAlign w:val="center"/>
+            <w:tcMar>
+              <w:top w:w="100" w:type="dxa"/>
+              <w:start w:w="120" w:type="dxa"/>
+              <w:bottom w:w="100" w:type="dxa"/>
+              <w:end w:w="120" w:type="dxa"/>
+            </w:tcMar>
+          </w:tcPr>
+          <w:p>
+            <w:pPr>
+              <w:jc w:val="center"/>
+            </w:pPr>
+            <w:r>
+              <w:rPr>
+                <w:rFonts w:ascii="Arial" w:hAnsi="Arial" w:eastAsia="宋体"/>
+                <w:color w:val="000000"/>
+                <w:sz w:val="18"/>
+              </w:rPr>
+              <w:t>repetition_penalty</w:t>
+            </w:r>
+          </w:p>
+        </w:tc>
+        <w:tc>
+          <w:tcPr>
+            <w:tcW w:type="dxa" w:w="3005"/>
+            <w:shd w:fill="F2F6FA"/>
+            <w:vAlign w:val="center"/>
+            <w:tcMar>
+              <w:top w:w="100" w:type="dxa"/>
+              <w:start w:w="120" w:type="dxa"/>
+              <w:bottom w:w="100" w:type="dxa"/>
+              <w:end w:w="120" w:type="dxa"/>
+            </w:tcMar>
+          </w:tcPr>
+          <w:p>
+            <w:pPr>
+              <w:jc w:val="left"/>
+            </w:pPr>
+            <w:r>
+              <w:rPr>
+                <w:rFonts w:ascii="Arial" w:hAnsi="Arial" w:eastAsia="宋体"/>
+                <w:color w:val="000000"/>
+                <w:sz w:val="18"/>
+              </w:rPr>
+              <w:t>降低重复片段概率</w:t>
+            </w:r>
+          </w:p>
+        </w:tc>
+        <w:tc>
+          <w:tcPr>
+            <w:tcW w:type="dxa" w:w="3742"/>
+            <w:shd w:fill="F2F6FA"/>
+            <w:vAlign w:val="center"/>
+            <w:tcMar>
+              <w:top w:w="100" w:type="dxa"/>
+              <w:start w:w="120" w:type="dxa"/>
+              <w:bottom w:w="100" w:type="dxa"/>
+              <w:end w:w="120" w:type="dxa"/>
+            </w:tcMar>
+          </w:tcPr>
+          <w:p>
+            <w:pPr>
+              <w:jc w:val="left"/>
+            </w:pPr>
+            <w:r>
+              <w:rPr>
+                <w:rFonts w:ascii="Arial" w:hAnsi="Arial" w:eastAsia="宋体"/>
+                <w:color w:val="000000"/>
+                <w:sz w:val="18"/>
+              </w:rPr>
+              <w:t>过高可能破坏语句自然度</w:t>
+            </w:r>
+          </w:p>
+        </w:tc>
+      </w:tr>
+      <w:tr>
+        <w:tc>
+          <w:tcPr>
+            <w:tcW w:type="dxa" w:w="2154"/>
+            <w:vAlign w:val="center"/>
+            <w:tcMar>
+              <w:top w:w="100" w:type="dxa"/>
+              <w:start w:w="120" w:type="dxa"/>
+              <w:bottom w:w="100" w:type="dxa"/>
+              <w:end w:w="120" w:type="dxa"/>
+            </w:tcMar>
+          </w:tcPr>
+          <w:p>
+            <w:pPr>
+              <w:jc w:val="center"/>
+            </w:pPr>
+            <w:r>
+              <w:rPr>
+                <w:rFonts w:ascii="Arial" w:hAnsi="Arial" w:eastAsia="宋体"/>
+                <w:color w:val="000000"/>
+                <w:sz w:val="18"/>
+              </w:rPr>
+              <w:t>max_new_tokens</w:t>
+            </w:r>
+          </w:p>
+        </w:tc>
+        <w:tc>
+          <w:tcPr>
+            <w:tcW w:type="dxa" w:w="3005"/>
+            <w:vAlign w:val="center"/>
+            <w:tcMar>
+              <w:top w:w="100" w:type="dxa"/>
+              <w:start w:w="120" w:type="dxa"/>
+              <w:bottom w:w="100" w:type="dxa"/>
+              <w:end w:w="120" w:type="dxa"/>
+            </w:tcMar>
+          </w:tcPr>
+          <w:p>
+            <w:pPr>
+              <w:jc w:val="left"/>
+            </w:pPr>
+            <w:r>
+              <w:rPr>
+                <w:rFonts w:ascii="Arial" w:hAnsi="Arial" w:eastAsia="宋体"/>
+                <w:color w:val="000000"/>
+                <w:sz w:val="18"/>
+              </w:rPr>
+              <w:t>限制新增令牌数量</w:t>
+            </w:r>
+          </w:p>
+        </w:tc>
+        <w:tc>
+          <w:tcPr>
+            <w:tcW w:type="dxa" w:w="3742"/>
+            <w:vAlign w:val="center"/>
+            <w:tcMar>
+              <w:top w:w="100" w:type="dxa"/>
+              <w:start w:w="120" w:type="dxa"/>
+              <w:bottom w:w="100" w:type="dxa"/>
+              <w:end w:w="120" w:type="dxa"/>
+            </w:tcMar>
+          </w:tcPr>
+          <w:p>
+            <w:pPr>
+              <w:jc w:val="left"/>
+            </w:pPr>
+            <w:r>
+              <w:rPr>
+                <w:rFonts w:ascii="Arial" w:hAnsi="Arial" w:eastAsia="宋体"/>
+                <w:color w:val="000000"/>
+                <w:sz w:val="18"/>
+              </w:rPr>
+              <w:t>按学段在配置文件中分别设置</w:t>
+            </w:r>
+          </w:p>
+        </w:tc>
+      </w:tr>
+      <w:tr>
+        <w:tc>
+          <w:tcPr>
+            <w:tcW w:type="dxa" w:w="2154"/>
+            <w:shd w:fill="F2F6FA"/>
+            <w:vAlign w:val="center"/>
+            <w:tcMar>
+              <w:top w:w="100" w:type="dxa"/>
+              <w:start w:w="120" w:type="dxa"/>
+              <w:bottom w:w="100" w:type="dxa"/>
+              <w:end w:w="120" w:type="dxa"/>
+            </w:tcMar>
+          </w:tcPr>
+          <w:p>
+            <w:pPr>
+              <w:jc w:val="center"/>
+            </w:pPr>
+            <w:r>
+              <w:rPr>
+                <w:rFonts w:ascii="Arial" w:hAnsi="Arial" w:eastAsia="宋体"/>
+                <w:color w:val="000000"/>
+                <w:sz w:val="18"/>
+              </w:rPr>
+              <w:t>seed</w:t>
+            </w:r>
+          </w:p>
+        </w:tc>
+        <w:tc>
+          <w:tcPr>
+            <w:tcW w:type="dxa" w:w="3005"/>
+            <w:shd w:fill="F2F6FA"/>
+            <w:vAlign w:val="center"/>
+            <w:tcMar>
+              <w:top w:w="100" w:type="dxa"/>
+              <w:start w:w="120" w:type="dxa"/>
+              <w:bottom w:w="100" w:type="dxa"/>
+              <w:end w:w="120" w:type="dxa"/>
+            </w:tcMar>
+          </w:tcPr>
+          <w:p>
+            <w:pPr>
+              <w:jc w:val="left"/>
+            </w:pPr>
+            <w:r>
+              <w:rPr>
+                <w:rFonts w:ascii="Arial" w:hAnsi="Arial" w:eastAsia="宋体"/>
+                <w:color w:val="000000"/>
+                <w:sz w:val="18"/>
+              </w:rPr>
+              <w:t>设置随机种子</w:t>
+            </w:r>
+          </w:p>
+        </w:tc>
+        <w:tc>
+          <w:tcPr>
+            <w:tcW w:type="dxa" w:w="3742"/>
+            <w:shd w:fill="F2F6FA"/>
+            <w:vAlign w:val="center"/>
+            <w:tcMar>
+              <w:top w:w="100" w:type="dxa"/>
+              <w:start w:w="120" w:type="dxa"/>
+              <w:bottom w:w="100" w:type="dxa"/>
+              <w:end w:w="120" w:type="dxa"/>
+            </w:tcMar>
+          </w:tcPr>
+          <w:p>
+            <w:pPr>
+              <w:jc w:val="left"/>
+            </w:pPr>
+            <w:r>
+              <w:rPr>
+                <w:rFonts w:ascii="Arial" w:hAnsi="Arial" w:eastAsia="宋体"/>
+                <w:color w:val="000000"/>
+                <w:sz w:val="18"/>
+              </w:rPr>
+              <w:t>用于同一环境下复现实验</w:t>
+            </w:r>
+          </w:p>
+        </w:tc>
+      </w:tr>
+    </w:tbl>
+    <w:p/>
+    <w:p>
+      <w:pPr>
         <w:pStyle w:val="Heading1"/>
         <w:keepNext/>
       </w:pPr>
@@ -3155,6 +4349,103 @@
     </w:p>
     <w:p>
       <w:pPr>
+        <w:pStyle w:val="Heading2"/>
+        <w:keepNext/>
+      </w:pPr>
+      <w:r>
+        <w:t>6.3 批处理结果检查</w:t>
+      </w:r>
+    </w:p>
+    <w:p>
+      <w:pPr>
+        <w:ind w:left="454" w:hanging="340"/>
+      </w:pPr>
+      <w:r>
+        <w:rPr>
+          <w:rFonts w:ascii="Arial" w:hAnsi="Arial" w:eastAsia="宋体"/>
+          <w:b/>
+          <w:color w:val="000000"/>
+          <w:sz w:val="21"/>
+        </w:rPr>
+        <w:t xml:space="preserve">1. </w:t>
+      </w:r>
+      <w:r>
+        <w:rPr>
+          <w:rFonts w:ascii="Arial" w:hAnsi="Arial" w:eastAsia="宋体"/>
+          <w:color w:val="000000"/>
+          <w:sz w:val="21"/>
+        </w:rPr>
+        <w:t>打开 summary.json，确认 generated、passed、failed 和 average_score 等汇总值符合任务规模。</w:t>
+      </w:r>
+    </w:p>
+    <w:p>
+      <w:pPr>
+        <w:ind w:left="454" w:hanging="340"/>
+      </w:pPr>
+      <w:r>
+        <w:rPr>
+          <w:rFonts w:ascii="Arial" w:hAnsi="Arial" w:eastAsia="宋体"/>
+          <w:b/>
+          <w:color w:val="000000"/>
+          <w:sz w:val="21"/>
+        </w:rPr>
+        <w:t xml:space="preserve">2. </w:t>
+      </w:r>
+      <w:r>
+        <w:rPr>
+          <w:rFonts w:ascii="Arial" w:hAnsi="Arial" w:eastAsia="宋体"/>
+          <w:color w:val="000000"/>
+          <w:sz w:val="21"/>
+        </w:rPr>
+        <w:t>打开 articles.jsonl，逐行检查 topic、level、content、backend 和 evaluation 字段。</w:t>
+      </w:r>
+    </w:p>
+    <w:p>
+      <w:pPr>
+        <w:ind w:left="454" w:hanging="340"/>
+      </w:pPr>
+      <w:r>
+        <w:rPr>
+          <w:rFonts w:ascii="Arial" w:hAnsi="Arial" w:eastAsia="宋体"/>
+          <w:b/>
+          <w:color w:val="000000"/>
+          <w:sz w:val="21"/>
+        </w:rPr>
+        <w:t xml:space="preserve">3. </w:t>
+      </w:r>
+      <w:r>
+        <w:rPr>
+          <w:rFonts w:ascii="Arial" w:hAnsi="Arial" w:eastAsia="宋体"/>
+          <w:color w:val="000000"/>
+          <w:sz w:val="21"/>
+        </w:rPr>
+        <w:t>若存在 errors.jsonl，根据 line_number 定位输入行，并根据 error_type 和 message 修正任务。</w:t>
+      </w:r>
+    </w:p>
+    <w:p>
+      <w:pPr>
+        <w:ind w:left="454" w:hanging="340"/>
+      </w:pPr>
+      <w:r>
+        <w:rPr>
+          <w:rFonts w:ascii="Arial" w:hAnsi="Arial" w:eastAsia="宋体"/>
+          <w:b/>
+          <w:color w:val="000000"/>
+          <w:sz w:val="21"/>
+        </w:rPr>
+        <w:t xml:space="preserve">4. </w:t>
+      </w:r>
+      <w:r>
+        <w:rPr>
+          <w:rFonts w:ascii="Arial" w:hAnsi="Arial" w:eastAsia="宋体"/>
+          <w:color w:val="000000"/>
+          <w:sz w:val="21"/>
+        </w:rPr>
+        <w:t>使用浏览器打开 report.html 进行人工抽查；使用表格软件打开 summary.csv 进行筛选或汇总。</w:t>
+      </w:r>
+    </w:p>
+    <w:p>
+      <w:pPr>
         <w:pStyle w:val="Heading1"/>
         <w:keepNext/>
       </w:pPr>
@@ -3191,6 +4482,64 @@
     </w:p>
     <w:p>
       <w:pPr>
+        <w:pStyle w:val="Heading2"/>
+        <w:keepNext/>
+      </w:pPr>
+      <w:r>
+        <w:t>7.1 原始标注格式</w:t>
+      </w:r>
+    </w:p>
+    <w:p>
+      <w:pPr>
+        <w:ind w:firstLine="420"/>
+      </w:pPr>
+      <w:r>
+        <w:rPr>
+          <w:rFonts w:ascii="Arial" w:hAnsi="Arial" w:eastAsia="宋体"/>
+          <w:color w:val="000000"/>
+          <w:sz w:val="21"/>
+        </w:rPr>
+        <w:t>每个非空行只能表示一个样本。正文与等级之间必须使用真正的 TAB 字符，而不是多个空格。等级 0 表示小学，1 表示初中，2 表示高中。转换过程中遇到缺少 TAB、正文为空或等级无法识别时，程序会报告具体行号。</w:t>
+      </w:r>
+    </w:p>
+    <w:p>
+      <w:pPr>
+        <w:pStyle w:val="Heading2"/>
+        <w:keepNext/>
+      </w:pPr>
+      <w:r>
+        <w:t>7.2 转换结果核验</w:t>
+      </w:r>
+    </w:p>
+    <w:p>
+      <w:pPr>
+        <w:spacing w:after="0" w:line="240" w:lineRule="auto"/>
+        <w:ind w:left="454"/>
+      </w:pPr>
+      <w:r>
+        <w:rPr>
+          <w:rFonts w:ascii="Consolas" w:hAnsi="Consolas" w:eastAsia="等线"/>
+          <w:color w:val="000000"/>
+          <w:sz w:val="18"/>
+        </w:rPr>
+        <w:t>python -m json.tool --json-lines data/train.jsonl</w:t>
+      </w:r>
+    </w:p>
+    <w:p>
+      <w:pPr>
+        <w:ind w:firstLine="420"/>
+      </w:pPr>
+      <w:r>
+        <w:rPr>
+          <w:rFonts w:ascii="Arial" w:hAnsi="Arial" w:eastAsia="宋体"/>
+          <w:color w:val="000000"/>
+          <w:sz w:val="21"/>
+        </w:rPr>
+        <w:t>每行应包含 instruction、input、output 和 level。output 保存训练正文，level 使用 primary、junior 或 senior。正式训练前建议检查样本是否含乱码、敏感信息、重复文本以及超出目标学段的内容。</w:t>
+      </w:r>
+    </w:p>
+    <w:p>
+      <w:pPr>
         <w:pStyle w:val="Heading1"/>
         <w:keepNext/>
       </w:pPr>
@@ -3222,7 +4571,63 @@
           <w:color w:val="000000"/>
           <w:sz w:val="18"/>
         </w:rPr>
-        <w:t>llmctg train --model-path D:/models/Qwen --dataset data/train.jsonl --output models/reading-lora --epochs 3 --batch-size 1 --max-length 1024 --device auto</w:t>
+        <w:t>CUDA_VISIBLE_DEVICES=0 llmctg train \</w:t>
+      </w:r>
+    </w:p>
+    <w:p>
+      <w:pPr>
+        <w:spacing w:after="0" w:line="240" w:lineRule="auto"/>
+        <w:ind w:left="454"/>
+      </w:pPr>
+      <w:r>
+        <w:rPr>
+          <w:rFonts w:ascii="Consolas" w:hAnsi="Consolas" w:eastAsia="等线"/>
+          <w:color w:val="000000"/>
+          <w:sz w:val="18"/>
+        </w:rPr>
+        <w:t xml:space="preserve">  --model-path /home/wangzy/workplace/wyc/Qwen3-1.7B \</w:t>
+      </w:r>
+    </w:p>
+    <w:p>
+      <w:pPr>
+        <w:spacing w:after="0" w:line="240" w:lineRule="auto"/>
+        <w:ind w:left="454"/>
+      </w:pPr>
+      <w:r>
+        <w:rPr>
+          <w:rFonts w:ascii="Consolas" w:hAnsi="Consolas" w:eastAsia="等线"/>
+          <w:color w:val="000000"/>
+          <w:sz w:val="18"/>
+        </w:rPr>
+        <w:t xml:space="preserve">  --dataset test_data/llmctg_smoke_train.jsonl \</w:t>
+      </w:r>
+    </w:p>
+    <w:p>
+      <w:pPr>
+        <w:spacing w:after="0" w:line="240" w:lineRule="auto"/>
+        <w:ind w:left="454"/>
+      </w:pPr>
+      <w:r>
+        <w:rPr>
+          <w:rFonts w:ascii="Consolas" w:hAnsi="Consolas" w:eastAsia="等线"/>
+          <w:color w:val="000000"/>
+          <w:sz w:val="18"/>
+        </w:rPr>
+        <w:t xml:space="preserve">  --output test_output/qwen3-1.7b-lora-smoke \</w:t>
+      </w:r>
+    </w:p>
+    <w:p>
+      <w:pPr>
+        <w:spacing w:after="0" w:line="240" w:lineRule="auto"/>
+        <w:ind w:left="454"/>
+      </w:pPr>
+      <w:r>
+        <w:rPr>
+          <w:rFonts w:ascii="Consolas" w:hAnsi="Consolas" w:eastAsia="等线"/>
+          <w:color w:val="000000"/>
+          <w:sz w:val="18"/>
+        </w:rPr>
+        <w:t xml:space="preserve">  --epochs 1 --batch-size 1 --max-length 256 --device cuda:0</w:t>
       </w:r>
     </w:p>
     <w:p>
@@ -3250,7 +4655,7 @@
           <w:color w:val="000000"/>
           <w:sz w:val="21"/>
         </w:rPr>
-        <w:t>CUDA 环境启用半精度与梯度检查点；CPU 环境使用单精度。</w:t>
+        <w:t>CUDA 环境使用半精度并启用梯度检查点与输入梯度，以降低训练显存压力；CPU 环境使用单精度。</w:t>
       </w:r>
     </w:p>
     <w:p>
@@ -3279,6 +4684,147 @@
           <w:sz w:val="21"/>
         </w:rPr>
         <w:t>训练损失只反映拟合过程，不能代替独立测试集和人工内容评价。</w:t>
+      </w:r>
+    </w:p>
+    <w:p>
+      <w:pPr>
+        <w:pStyle w:val="Heading2"/>
+        <w:keepNext/>
+      </w:pPr>
+      <w:r>
+        <w:t>8.1 训练过程观察</w:t>
+      </w:r>
+    </w:p>
+    <w:p>
+      <w:pPr>
+        <w:ind w:firstLine="420"/>
+      </w:pPr>
+      <w:r>
+        <w:rPr>
+          <w:rFonts w:ascii="Arial" w:hAnsi="Arial" w:eastAsia="宋体"/>
+          <w:color w:val="000000"/>
+          <w:sz w:val="21"/>
+        </w:rPr>
+        <w:t>训练启动后依次显示模型分片加载、数据映射和进度条。可在另一个终端运行 nvitop 或 nvidia-smi 观察显存与利用率。12 条样本、单卡、批量大小 1、梯度累积 4 时通常约有 3 个优化步；具体步数可能随 Transformers 版本和分布式环境变化。</w:t>
+      </w:r>
+    </w:p>
+    <w:p>
+      <w:pPr>
+        <w:pStyle w:val="Heading2"/>
+        <w:keepNext/>
+      </w:pPr>
+      <w:r>
+        <w:t>8.2 训练成功判据</w:t>
+      </w:r>
+    </w:p>
+    <w:p>
+      <w:pPr>
+        <w:ind w:left="454" w:hanging="340"/>
+      </w:pPr>
+      <w:r>
+        <w:rPr>
+          <w:rFonts w:ascii="Arial" w:hAnsi="Arial" w:eastAsia="宋体"/>
+          <w:b/>
+          <w:color w:val="000000"/>
+          <w:sz w:val="21"/>
+        </w:rPr>
+        <w:t xml:space="preserve">1. </w:t>
+      </w:r>
+      <w:r>
+        <w:rPr>
+          <w:rFonts w:ascii="Arial" w:hAnsi="Arial" w:eastAsia="宋体"/>
+          <w:color w:val="000000"/>
+          <w:sz w:val="21"/>
+        </w:rPr>
+        <w:t>命令正常返回，结果 JSON 中包含 output_dir、train_samples、train_loss、global_step 和 device。</w:t>
+      </w:r>
+    </w:p>
+    <w:p>
+      <w:pPr>
+        <w:ind w:left="454" w:hanging="340"/>
+      </w:pPr>
+      <w:r>
+        <w:rPr>
+          <w:rFonts w:ascii="Arial" w:hAnsi="Arial" w:eastAsia="宋体"/>
+          <w:b/>
+          <w:color w:val="000000"/>
+          <w:sz w:val="21"/>
+        </w:rPr>
+        <w:t xml:space="preserve">2. </w:t>
+      </w:r>
+      <w:r>
+        <w:rPr>
+          <w:rFonts w:ascii="Arial" w:hAnsi="Arial" w:eastAsia="宋体"/>
+          <w:color w:val="000000"/>
+          <w:sz w:val="21"/>
+        </w:rPr>
+        <w:t>输出目录存在 adapter_config.json 和 adapter_model.safetensors。</w:t>
+      </w:r>
+    </w:p>
+    <w:p>
+      <w:pPr>
+        <w:ind w:left="454" w:hanging="340"/>
+      </w:pPr>
+      <w:r>
+        <w:rPr>
+          <w:rFonts w:ascii="Arial" w:hAnsi="Arial" w:eastAsia="宋体"/>
+          <w:b/>
+          <w:color w:val="000000"/>
+          <w:sz w:val="21"/>
+        </w:rPr>
+        <w:t xml:space="preserve">3. </w:t>
+      </w:r>
+      <w:r>
+        <w:rPr>
+          <w:rFonts w:ascii="Arial" w:hAnsi="Arial" w:eastAsia="宋体"/>
+          <w:color w:val="000000"/>
+          <w:sz w:val="21"/>
+        </w:rPr>
+        <w:t>分词器相关文件已保存，可以与基础模型共同用于推理。</w:t>
+      </w:r>
+    </w:p>
+    <w:p>
+      <w:pPr>
+        <w:ind w:left="454" w:hanging="340"/>
+      </w:pPr>
+      <w:r>
+        <w:rPr>
+          <w:rFonts w:ascii="Arial" w:hAnsi="Arial" w:eastAsia="宋体"/>
+          <w:b/>
+          <w:color w:val="000000"/>
+          <w:sz w:val="21"/>
+        </w:rPr>
+        <w:t xml:space="preserve">4. </w:t>
+      </w:r>
+      <w:r>
+        <w:rPr>
+          <w:rFonts w:ascii="Arial" w:hAnsi="Arial" w:eastAsia="宋体"/>
+          <w:color w:val="000000"/>
+          <w:sz w:val="21"/>
+        </w:rPr>
+        <w:t>使用 --lora-path 完成至少一次真实生成，并确认 content 字段非空。</w:t>
+      </w:r>
+    </w:p>
+    <w:p>
+      <w:pPr>
+        <w:pStyle w:val="Heading2"/>
+        <w:keepNext/>
+      </w:pPr>
+      <w:r>
+        <w:t>8.3 单卡与多卡说明</w:t>
+      </w:r>
+    </w:p>
+    <w:p>
+      <w:pPr>
+        <w:ind w:firstLine="420"/>
+      </w:pPr>
+      <w:r>
+        <w:rPr>
+          <w:rFonts w:ascii="Arial" w:hAnsi="Arial" w:eastAsia="宋体"/>
+          <w:color w:val="000000"/>
+          <w:sz w:val="21"/>
+        </w:rPr>
+        <w:t>仅传入 --device cuda:0 不一定限制 Trainer 可见的显卡数量。小规模数据在多卡数据并行下可能因复制和同步开销而变慢。冒烟测试建议在命令前使用 CUDA_VISIBLE_DEVICES=0；正式训练再根据数据量和分布式训练方案决定是否使用多卡。</w:t>
       </w:r>
     </w:p>
     <w:p>
@@ -3502,6 +5048,163 @@
                 <w:sz w:val="18"/>
               </w:rPr>
               <w:t>生成后端</w:t>
+            </w:r>
+          </w:p>
+        </w:tc>
+      </w:tr>
+      <w:tr>
+        <w:tc>
+          <w:tcPr>
+            <w:tcW w:type="dxa" w:w="3402"/>
+            <w:shd w:fill="F2F6FA"/>
+            <w:vAlign w:val="center"/>
+            <w:tcMar>
+              <w:top w:w="100" w:type="dxa"/>
+              <w:start w:w="120" w:type="dxa"/>
+              <w:bottom w:w="100" w:type="dxa"/>
+              <w:end w:w="120" w:type="dxa"/>
+            </w:tcMar>
+          </w:tcPr>
+          <w:p>
+            <w:pPr>
+              <w:jc w:val="center"/>
+            </w:pPr>
+            <w:r>
+              <w:rPr>
+                <w:rFonts w:ascii="Arial" w:hAnsi="Arial" w:eastAsia="宋体"/>
+                <w:color w:val="000000"/>
+                <w:sz w:val="18"/>
+              </w:rPr>
+              <w:t>generation.model_path</w:t>
+            </w:r>
+          </w:p>
+        </w:tc>
+        <w:tc>
+          <w:tcPr>
+            <w:tcW w:type="dxa" w:w="1701"/>
+            <w:shd w:fill="F2F6FA"/>
+            <w:vAlign w:val="center"/>
+            <w:tcMar>
+              <w:top w:w="100" w:type="dxa"/>
+              <w:start w:w="120" w:type="dxa"/>
+              <w:bottom w:w="100" w:type="dxa"/>
+              <w:end w:w="120" w:type="dxa"/>
+            </w:tcMar>
+          </w:tcPr>
+          <w:p>
+            <w:pPr>
+              <w:jc w:val="left"/>
+            </w:pPr>
+            <w:r>
+              <w:rPr>
+                <w:rFonts w:ascii="Arial" w:hAnsi="Arial" w:eastAsia="宋体"/>
+                <w:color w:val="000000"/>
+                <w:sz w:val="18"/>
+              </w:rPr>
+              <w:t>空</w:t>
+            </w:r>
+          </w:p>
+        </w:tc>
+        <w:tc>
+          <w:tcPr>
+            <w:tcW w:type="dxa" w:w="3798"/>
+            <w:shd w:fill="F2F6FA"/>
+            <w:vAlign w:val="center"/>
+            <w:tcMar>
+              <w:top w:w="100" w:type="dxa"/>
+              <w:start w:w="120" w:type="dxa"/>
+              <w:bottom w:w="100" w:type="dxa"/>
+              <w:end w:w="120" w:type="dxa"/>
+            </w:tcMar>
+          </w:tcPr>
+          <w:p>
+            <w:pPr>
+              <w:jc w:val="left"/>
+            </w:pPr>
+            <w:r>
+              <w:rPr>
+                <w:rFonts w:ascii="Arial" w:hAnsi="Arial" w:eastAsia="宋体"/>
+                <w:color w:val="000000"/>
+                <w:sz w:val="18"/>
+              </w:rPr>
+              <w:t>本地基础模型目录</w:t>
+            </w:r>
+          </w:p>
+        </w:tc>
+      </w:tr>
+      <w:tr>
+        <w:tc>
+          <w:tcPr>
+            <w:tcW w:type="dxa" w:w="3402"/>
+            <w:vAlign w:val="center"/>
+            <w:tcMar>
+              <w:top w:w="100" w:type="dxa"/>
+              <w:start w:w="120" w:type="dxa"/>
+              <w:bottom w:w="100" w:type="dxa"/>
+              <w:end w:w="120" w:type="dxa"/>
+            </w:tcMar>
+          </w:tcPr>
+          <w:p>
+            <w:pPr>
+              <w:jc w:val="center"/>
+            </w:pPr>
+            <w:r>
+              <w:rPr>
+                <w:rFonts w:ascii="Arial" w:hAnsi="Arial" w:eastAsia="宋体"/>
+                <w:color w:val="000000"/>
+                <w:sz w:val="18"/>
+              </w:rPr>
+              <w:t>generation.lora_path</w:t>
+            </w:r>
+          </w:p>
+        </w:tc>
+        <w:tc>
+          <w:tcPr>
+            <w:tcW w:type="dxa" w:w="1701"/>
+            <w:vAlign w:val="center"/>
+            <w:tcMar>
+              <w:top w:w="100" w:type="dxa"/>
+              <w:start w:w="120" w:type="dxa"/>
+              <w:bottom w:w="100" w:type="dxa"/>
+              <w:end w:w="120" w:type="dxa"/>
+            </w:tcMar>
+          </w:tcPr>
+          <w:p>
+            <w:pPr>
+              <w:jc w:val="left"/>
+            </w:pPr>
+            <w:r>
+              <w:rPr>
+                <w:rFonts w:ascii="Arial" w:hAnsi="Arial" w:eastAsia="宋体"/>
+                <w:color w:val="000000"/>
+                <w:sz w:val="18"/>
+              </w:rPr>
+              <w:t>空</w:t>
+            </w:r>
+          </w:p>
+        </w:tc>
+        <w:tc>
+          <w:tcPr>
+            <w:tcW w:type="dxa" w:w="3798"/>
+            <w:vAlign w:val="center"/>
+            <w:tcMar>
+              <w:top w:w="100" w:type="dxa"/>
+              <w:start w:w="120" w:type="dxa"/>
+              <w:bottom w:w="100" w:type="dxa"/>
+              <w:end w:w="120" w:type="dxa"/>
+            </w:tcMar>
+          </w:tcPr>
+          <w:p>
+            <w:pPr>
+              <w:jc w:val="left"/>
+            </w:pPr>
+            <w:r>
+              <w:rPr>
+                <w:rFonts w:ascii="Arial" w:hAnsi="Arial" w:eastAsia="宋体"/>
+                <w:color w:val="000000"/>
+                <w:sz w:val="18"/>
+              </w:rPr>
+              <w:t>可选 LoRA 适配器目录</w:t>
             </w:r>
           </w:p>
         </w:tc>
@@ -4087,7 +5790,1115 @@
         <w:keepNext/>
       </w:pPr>
       <w:r>
-        <w:t>11 常见问题与故障处理</w:t>
+        <w:t>11 一键功能测试</w:t>
+      </w:r>
+    </w:p>
+    <w:p>
+      <w:pPr>
+        <w:ind w:firstLine="420"/>
+      </w:pPr>
+      <w:r>
+        <w:rPr>
+          <w:rFonts w:ascii="Arial" w:hAnsi="Arial" w:eastAsia="宋体"/>
+          <w:color w:val="000000"/>
+          <w:sz w:val="21"/>
+        </w:rPr>
+        <w:t>scripts/one_click_test.py 用于完成全功能验收。脚本采用预设 Linux 路径，按时间创建独立输出目录，逐项显示运行功能与预期结果，并在结束时写入 test_summary.json。某一项失败后，脚本会记录失败并继续执行后续独立项目。</w:t>
+      </w:r>
+    </w:p>
+    <w:p>
+      <w:pPr>
+        <w:spacing w:after="0" w:line="240" w:lineRule="auto"/>
+        <w:ind w:left="454"/>
+      </w:pPr>
+      <w:r>
+        <w:rPr>
+          <w:rFonts w:ascii="Consolas" w:hAnsi="Consolas" w:eastAsia="等线"/>
+          <w:color w:val="000000"/>
+          <w:sz w:val="18"/>
+        </w:rPr>
+        <w:t>cd /home/wangzy/workplace/wyc/llmctg</w:t>
+      </w:r>
+    </w:p>
+    <w:p>
+      <w:pPr>
+        <w:spacing w:after="0" w:line="240" w:lineRule="auto"/>
+        <w:ind w:left="454"/>
+      </w:pPr>
+      <w:r>
+        <w:rPr>
+          <w:rFonts w:ascii="Consolas" w:hAnsi="Consolas" w:eastAsia="等线"/>
+          <w:color w:val="000000"/>
+          <w:sz w:val="18"/>
+        </w:rPr>
+        <w:t>python scripts/one_click_test.py</w:t>
+      </w:r>
+    </w:p>
+    <w:tbl>
+      <w:tblPr>
+        <w:tblStyle w:val="TableGrid"/>
+        <w:tblW w:type="auto" w:w="0"/>
+        <w:jc w:val="center"/>
+        <w:tblLook w:firstColumn="1" w:firstRow="1" w:lastColumn="0" w:lastRow="0" w:noHBand="0" w:noVBand="1" w:val="04A0"/>
+      </w:tblPr>
+      <w:tblGrid>
+        <w:gridCol w:w="3135"/>
+        <w:gridCol w:w="3135"/>
+        <w:gridCol w:w="3135"/>
+      </w:tblGrid>
+      <w:tr>
+        <w:trPr>
+          <w:tblHeader/>
+        </w:trPr>
+        <w:tc>
+          <w:tcPr>
+            <w:tcW w:type="dxa" w:w="1247"/>
+            <w:shd w:fill="1F4E78"/>
+            <w:vAlign w:val="center"/>
+            <w:tcMar>
+              <w:top w:w="100" w:type="dxa"/>
+              <w:start w:w="120" w:type="dxa"/>
+              <w:bottom w:w="100" w:type="dxa"/>
+              <w:end w:w="120" w:type="dxa"/>
+            </w:tcMar>
+          </w:tcPr>
+          <w:p>
+            <w:pPr>
+              <w:jc w:val="center"/>
+            </w:pPr>
+            <w:r>
+              <w:rPr>
+                <w:rFonts w:ascii="Arial" w:hAnsi="Arial" w:eastAsia="黑体"/>
+                <w:b/>
+                <w:color w:val="FFFFFF"/>
+                <w:sz w:val="19"/>
+              </w:rPr>
+              <w:t>测试序号</w:t>
+            </w:r>
+          </w:p>
+        </w:tc>
+        <w:tc>
+          <w:tcPr>
+            <w:tcW w:type="dxa" w:w="2948"/>
+            <w:shd w:fill="1F4E78"/>
+            <w:vAlign w:val="center"/>
+            <w:tcMar>
+              <w:top w:w="100" w:type="dxa"/>
+              <w:start w:w="120" w:type="dxa"/>
+              <w:bottom w:w="100" w:type="dxa"/>
+              <w:end w:w="120" w:type="dxa"/>
+            </w:tcMar>
+          </w:tcPr>
+          <w:p>
+            <w:pPr>
+              <w:jc w:val="center"/>
+            </w:pPr>
+            <w:r>
+              <w:rPr>
+                <w:rFonts w:ascii="Arial" w:hAnsi="Arial" w:eastAsia="黑体"/>
+                <w:b/>
+                <w:color w:val="FFFFFF"/>
+                <w:sz w:val="19"/>
+              </w:rPr>
+              <w:t>功能</w:t>
+            </w:r>
+          </w:p>
+        </w:tc>
+        <w:tc>
+          <w:tcPr>
+            <w:tcW w:type="dxa" w:w="4706"/>
+            <w:shd w:fill="1F4E78"/>
+            <w:vAlign w:val="center"/>
+            <w:tcMar>
+              <w:top w:w="100" w:type="dxa"/>
+              <w:start w:w="120" w:type="dxa"/>
+              <w:bottom w:w="100" w:type="dxa"/>
+              <w:end w:w="120" w:type="dxa"/>
+            </w:tcMar>
+          </w:tcPr>
+          <w:p>
+            <w:pPr>
+              <w:jc w:val="center"/>
+            </w:pPr>
+            <w:r>
+              <w:rPr>
+                <w:rFonts w:ascii="Arial" w:hAnsi="Arial" w:eastAsia="黑体"/>
+                <w:b/>
+                <w:color w:val="FFFFFF"/>
+                <w:sz w:val="19"/>
+              </w:rPr>
+              <w:t>主要成功判据</w:t>
+            </w:r>
+          </w:p>
+        </w:tc>
+      </w:tr>
+      <w:tr>
+        <w:tc>
+          <w:tcPr>
+            <w:tcW w:type="dxa" w:w="1247"/>
+            <w:vAlign w:val="center"/>
+            <w:tcMar>
+              <w:top w:w="100" w:type="dxa"/>
+              <w:start w:w="120" w:type="dxa"/>
+              <w:bottom w:w="100" w:type="dxa"/>
+              <w:end w:w="120" w:type="dxa"/>
+            </w:tcMar>
+          </w:tcPr>
+          <w:p>
+            <w:pPr>
+              <w:jc w:val="center"/>
+            </w:pPr>
+            <w:r>
+              <w:rPr>
+                <w:rFonts w:ascii="Arial" w:hAnsi="Arial" w:eastAsia="宋体"/>
+                <w:color w:val="000000"/>
+                <w:sz w:val="18"/>
+              </w:rPr>
+              <w:t>1</w:t>
+            </w:r>
+          </w:p>
+        </w:tc>
+        <w:tc>
+          <w:tcPr>
+            <w:tcW w:type="dxa" w:w="2948"/>
+            <w:vAlign w:val="center"/>
+            <w:tcMar>
+              <w:top w:w="100" w:type="dxa"/>
+              <w:start w:w="120" w:type="dxa"/>
+              <w:bottom w:w="100" w:type="dxa"/>
+              <w:end w:w="120" w:type="dxa"/>
+            </w:tcMar>
+          </w:tcPr>
+          <w:p>
+            <w:pPr>
+              <w:jc w:val="left"/>
+            </w:pPr>
+            <w:r>
+              <w:rPr>
+                <w:rFonts w:ascii="Arial" w:hAnsi="Arial" w:eastAsia="宋体"/>
+                <w:color w:val="000000"/>
+                <w:sz w:val="18"/>
+              </w:rPr>
+              <w:t>版本与命令入口</w:t>
+            </w:r>
+          </w:p>
+        </w:tc>
+        <w:tc>
+          <w:tcPr>
+            <w:tcW w:type="dxa" w:w="4706"/>
+            <w:vAlign w:val="center"/>
+            <w:tcMar>
+              <w:top w:w="100" w:type="dxa"/>
+              <w:start w:w="120" w:type="dxa"/>
+              <w:bottom w:w="100" w:type="dxa"/>
+              <w:end w:w="120" w:type="dxa"/>
+            </w:tcMar>
+          </w:tcPr>
+          <w:p>
+            <w:pPr>
+              <w:jc w:val="left"/>
+            </w:pPr>
+            <w:r>
+              <w:rPr>
+                <w:rFonts w:ascii="Arial" w:hAnsi="Arial" w:eastAsia="宋体"/>
+                <w:color w:val="000000"/>
+                <w:sz w:val="18"/>
+              </w:rPr>
+              <w:t>显示版本且退出码为 0</w:t>
+            </w:r>
+          </w:p>
+        </w:tc>
+      </w:tr>
+      <w:tr>
+        <w:tc>
+          <w:tcPr>
+            <w:tcW w:type="dxa" w:w="1247"/>
+            <w:shd w:fill="F2F6FA"/>
+            <w:vAlign w:val="center"/>
+            <w:tcMar>
+              <w:top w:w="100" w:type="dxa"/>
+              <w:start w:w="120" w:type="dxa"/>
+              <w:bottom w:w="100" w:type="dxa"/>
+              <w:end w:w="120" w:type="dxa"/>
+            </w:tcMar>
+          </w:tcPr>
+          <w:p>
+            <w:pPr>
+              <w:jc w:val="center"/>
+            </w:pPr>
+            <w:r>
+              <w:rPr>
+                <w:rFonts w:ascii="Arial" w:hAnsi="Arial" w:eastAsia="宋体"/>
+                <w:color w:val="000000"/>
+                <w:sz w:val="18"/>
+              </w:rPr>
+              <w:t>2</w:t>
+            </w:r>
+          </w:p>
+        </w:tc>
+        <w:tc>
+          <w:tcPr>
+            <w:tcW w:type="dxa" w:w="2948"/>
+            <w:shd w:fill="F2F6FA"/>
+            <w:vAlign w:val="center"/>
+            <w:tcMar>
+              <w:top w:w="100" w:type="dxa"/>
+              <w:start w:w="120" w:type="dxa"/>
+              <w:bottom w:w="100" w:type="dxa"/>
+              <w:end w:w="120" w:type="dxa"/>
+            </w:tcMar>
+          </w:tcPr>
+          <w:p>
+            <w:pPr>
+              <w:jc w:val="left"/>
+            </w:pPr>
+            <w:r>
+              <w:rPr>
+                <w:rFonts w:ascii="Arial" w:hAnsi="Arial" w:eastAsia="宋体"/>
+                <w:color w:val="000000"/>
+                <w:sz w:val="18"/>
+              </w:rPr>
+              <w:t>默认配置生成</w:t>
+            </w:r>
+          </w:p>
+        </w:tc>
+        <w:tc>
+          <w:tcPr>
+            <w:tcW w:type="dxa" w:w="4706"/>
+            <w:shd w:fill="F2F6FA"/>
+            <w:vAlign w:val="center"/>
+            <w:tcMar>
+              <w:top w:w="100" w:type="dxa"/>
+              <w:start w:w="120" w:type="dxa"/>
+              <w:bottom w:w="100" w:type="dxa"/>
+              <w:end w:w="120" w:type="dxa"/>
+            </w:tcMar>
+          </w:tcPr>
+          <w:p>
+            <w:pPr>
+              <w:jc w:val="left"/>
+            </w:pPr>
+            <w:r>
+              <w:rPr>
+                <w:rFonts w:ascii="Arial" w:hAnsi="Arial" w:eastAsia="宋体"/>
+                <w:color w:val="000000"/>
+                <w:sz w:val="18"/>
+              </w:rPr>
+              <w:t>JSON 包含 generation 和 evaluation</w:t>
+            </w:r>
+          </w:p>
+        </w:tc>
+      </w:tr>
+      <w:tr>
+        <w:tc>
+          <w:tcPr>
+            <w:tcW w:type="dxa" w:w="1247"/>
+            <w:vAlign w:val="center"/>
+            <w:tcMar>
+              <w:top w:w="100" w:type="dxa"/>
+              <w:start w:w="120" w:type="dxa"/>
+              <w:bottom w:w="100" w:type="dxa"/>
+              <w:end w:w="120" w:type="dxa"/>
+            </w:tcMar>
+          </w:tcPr>
+          <w:p>
+            <w:pPr>
+              <w:jc w:val="center"/>
+            </w:pPr>
+            <w:r>
+              <w:rPr>
+                <w:rFonts w:ascii="Arial" w:hAnsi="Arial" w:eastAsia="宋体"/>
+                <w:color w:val="000000"/>
+                <w:sz w:val="18"/>
+              </w:rPr>
+              <w:t>3</w:t>
+            </w:r>
+          </w:p>
+        </w:tc>
+        <w:tc>
+          <w:tcPr>
+            <w:tcW w:type="dxa" w:w="2948"/>
+            <w:vAlign w:val="center"/>
+            <w:tcMar>
+              <w:top w:w="100" w:type="dxa"/>
+              <w:start w:w="120" w:type="dxa"/>
+              <w:bottom w:w="100" w:type="dxa"/>
+              <w:end w:w="120" w:type="dxa"/>
+            </w:tcMar>
+          </w:tcPr>
+          <w:p>
+            <w:pPr>
+              <w:jc w:val="left"/>
+            </w:pPr>
+            <w:r>
+              <w:rPr>
+                <w:rFonts w:ascii="Arial" w:hAnsi="Arial" w:eastAsia="宋体"/>
+                <w:color w:val="000000"/>
+                <w:sz w:val="18"/>
+              </w:rPr>
+              <w:t>训练数据转换</w:t>
+            </w:r>
+          </w:p>
+        </w:tc>
+        <w:tc>
+          <w:tcPr>
+            <w:tcW w:type="dxa" w:w="4706"/>
+            <w:vAlign w:val="center"/>
+            <w:tcMar>
+              <w:top w:w="100" w:type="dxa"/>
+              <w:start w:w="120" w:type="dxa"/>
+              <w:bottom w:w="100" w:type="dxa"/>
+              <w:end w:w="120" w:type="dxa"/>
+            </w:tcMar>
+          </w:tcPr>
+          <w:p>
+            <w:pPr>
+              <w:jc w:val="left"/>
+            </w:pPr>
+            <w:r>
+              <w:rPr>
+                <w:rFonts w:ascii="Arial" w:hAnsi="Arial" w:eastAsia="宋体"/>
+                <w:color w:val="000000"/>
+                <w:sz w:val="18"/>
+              </w:rPr>
+              <w:t>生成至少 12 条有效 JSONL</w:t>
+            </w:r>
+          </w:p>
+        </w:tc>
+      </w:tr>
+      <w:tr>
+        <w:tc>
+          <w:tcPr>
+            <w:tcW w:type="dxa" w:w="1247"/>
+            <w:shd w:fill="F2F6FA"/>
+            <w:vAlign w:val="center"/>
+            <w:tcMar>
+              <w:top w:w="100" w:type="dxa"/>
+              <w:start w:w="120" w:type="dxa"/>
+              <w:bottom w:w="100" w:type="dxa"/>
+              <w:end w:w="120" w:type="dxa"/>
+            </w:tcMar>
+          </w:tcPr>
+          <w:p>
+            <w:pPr>
+              <w:jc w:val="center"/>
+            </w:pPr>
+            <w:r>
+              <w:rPr>
+                <w:rFonts w:ascii="Arial" w:hAnsi="Arial" w:eastAsia="宋体"/>
+                <w:color w:val="000000"/>
+                <w:sz w:val="18"/>
+              </w:rPr>
+              <w:t>4</w:t>
+            </w:r>
+          </w:p>
+        </w:tc>
+        <w:tc>
+          <w:tcPr>
+            <w:tcW w:type="dxa" w:w="2948"/>
+            <w:shd w:fill="F2F6FA"/>
+            <w:vAlign w:val="center"/>
+            <w:tcMar>
+              <w:top w:w="100" w:type="dxa"/>
+              <w:start w:w="120" w:type="dxa"/>
+              <w:bottom w:w="100" w:type="dxa"/>
+              <w:end w:w="120" w:type="dxa"/>
+            </w:tcMar>
+          </w:tcPr>
+          <w:p>
+            <w:pPr>
+              <w:jc w:val="left"/>
+            </w:pPr>
+            <w:r>
+              <w:rPr>
+                <w:rFonts w:ascii="Arial" w:hAnsi="Arial" w:eastAsia="宋体"/>
+                <w:color w:val="000000"/>
+                <w:sz w:val="18"/>
+              </w:rPr>
+              <w:t>模板文本生成</w:t>
+            </w:r>
+          </w:p>
+        </w:tc>
+        <w:tc>
+          <w:tcPr>
+            <w:tcW w:type="dxa" w:w="4706"/>
+            <w:shd w:fill="F2F6FA"/>
+            <w:vAlign w:val="center"/>
+            <w:tcMar>
+              <w:top w:w="100" w:type="dxa"/>
+              <w:start w:w="120" w:type="dxa"/>
+              <w:bottom w:w="100" w:type="dxa"/>
+              <w:end w:w="120" w:type="dxa"/>
+            </w:tcMar>
+          </w:tcPr>
+          <w:p>
+            <w:pPr>
+              <w:jc w:val="left"/>
+            </w:pPr>
+            <w:r>
+              <w:rPr>
+                <w:rFonts w:ascii="Arial" w:hAnsi="Arial" w:eastAsia="宋体"/>
+                <w:color w:val="000000"/>
+                <w:sz w:val="18"/>
+              </w:rPr>
+              <w:t>正文生成且 backend 为 template</w:t>
+            </w:r>
+          </w:p>
+        </w:tc>
+      </w:tr>
+      <w:tr>
+        <w:tc>
+          <w:tcPr>
+            <w:tcW w:type="dxa" w:w="1247"/>
+            <w:vAlign w:val="center"/>
+            <w:tcMar>
+              <w:top w:w="100" w:type="dxa"/>
+              <w:start w:w="120" w:type="dxa"/>
+              <w:bottom w:w="100" w:type="dxa"/>
+              <w:end w:w="120" w:type="dxa"/>
+            </w:tcMar>
+          </w:tcPr>
+          <w:p>
+            <w:pPr>
+              <w:jc w:val="center"/>
+            </w:pPr>
+            <w:r>
+              <w:rPr>
+                <w:rFonts w:ascii="Arial" w:hAnsi="Arial" w:eastAsia="宋体"/>
+                <w:color w:val="000000"/>
+                <w:sz w:val="18"/>
+              </w:rPr>
+              <w:t>5</w:t>
+            </w:r>
+          </w:p>
+        </w:tc>
+        <w:tc>
+          <w:tcPr>
+            <w:tcW w:type="dxa" w:w="2948"/>
+            <w:vAlign w:val="center"/>
+            <w:tcMar>
+              <w:top w:w="100" w:type="dxa"/>
+              <w:start w:w="120" w:type="dxa"/>
+              <w:bottom w:w="100" w:type="dxa"/>
+              <w:end w:w="120" w:type="dxa"/>
+            </w:tcMar>
+          </w:tcPr>
+          <w:p>
+            <w:pPr>
+              <w:jc w:val="left"/>
+            </w:pPr>
+            <w:r>
+              <w:rPr>
+                <w:rFonts w:ascii="Arial" w:hAnsi="Arial" w:eastAsia="宋体"/>
+                <w:color w:val="000000"/>
+                <w:sz w:val="18"/>
+              </w:rPr>
+              <w:t>文本质量评估</w:t>
+            </w:r>
+          </w:p>
+        </w:tc>
+        <w:tc>
+          <w:tcPr>
+            <w:tcW w:type="dxa" w:w="4706"/>
+            <w:vAlign w:val="center"/>
+            <w:tcMar>
+              <w:top w:w="100" w:type="dxa"/>
+              <w:start w:w="120" w:type="dxa"/>
+              <w:bottom w:w="100" w:type="dxa"/>
+              <w:end w:w="120" w:type="dxa"/>
+            </w:tcMar>
+          </w:tcPr>
+          <w:p>
+            <w:pPr>
+              <w:jc w:val="left"/>
+            </w:pPr>
+            <w:r>
+              <w:rPr>
+                <w:rFonts w:ascii="Arial" w:hAnsi="Arial" w:eastAsia="宋体"/>
+                <w:color w:val="000000"/>
+                <w:sz w:val="18"/>
+              </w:rPr>
+              <w:t>结果包含 metrics 和 statistics</w:t>
+            </w:r>
+          </w:p>
+        </w:tc>
+      </w:tr>
+      <w:tr>
+        <w:tc>
+          <w:tcPr>
+            <w:tcW w:type="dxa" w:w="1247"/>
+            <w:shd w:fill="F2F6FA"/>
+            <w:vAlign w:val="center"/>
+            <w:tcMar>
+              <w:top w:w="100" w:type="dxa"/>
+              <w:start w:w="120" w:type="dxa"/>
+              <w:bottom w:w="100" w:type="dxa"/>
+              <w:end w:w="120" w:type="dxa"/>
+            </w:tcMar>
+          </w:tcPr>
+          <w:p>
+            <w:pPr>
+              <w:jc w:val="center"/>
+            </w:pPr>
+            <w:r>
+              <w:rPr>
+                <w:rFonts w:ascii="Arial" w:hAnsi="Arial" w:eastAsia="宋体"/>
+                <w:color w:val="000000"/>
+                <w:sz w:val="18"/>
+              </w:rPr>
+              <w:t>6</w:t>
+            </w:r>
+          </w:p>
+        </w:tc>
+        <w:tc>
+          <w:tcPr>
+            <w:tcW w:type="dxa" w:w="2948"/>
+            <w:shd w:fill="F2F6FA"/>
+            <w:vAlign w:val="center"/>
+            <w:tcMar>
+              <w:top w:w="100" w:type="dxa"/>
+              <w:start w:w="120" w:type="dxa"/>
+              <w:bottom w:w="100" w:type="dxa"/>
+              <w:end w:w="120" w:type="dxa"/>
+            </w:tcMar>
+          </w:tcPr>
+          <w:p>
+            <w:pPr>
+              <w:jc w:val="left"/>
+            </w:pPr>
+            <w:r>
+              <w:rPr>
+                <w:rFonts w:ascii="Arial" w:hAnsi="Arial" w:eastAsia="宋体"/>
+                <w:color w:val="000000"/>
+                <w:sz w:val="18"/>
+              </w:rPr>
+              <w:t>批量任务处理</w:t>
+            </w:r>
+          </w:p>
+        </w:tc>
+        <w:tc>
+          <w:tcPr>
+            <w:tcW w:type="dxa" w:w="4706"/>
+            <w:shd w:fill="F2F6FA"/>
+            <w:vAlign w:val="center"/>
+            <w:tcMar>
+              <w:top w:w="100" w:type="dxa"/>
+              <w:start w:w="120" w:type="dxa"/>
+              <w:bottom w:w="100" w:type="dxa"/>
+              <w:end w:w="120" w:type="dxa"/>
+            </w:tcMar>
+          </w:tcPr>
+          <w:p>
+            <w:pPr>
+              <w:jc w:val="left"/>
+            </w:pPr>
+            <w:r>
+              <w:rPr>
+                <w:rFonts w:ascii="Arial" w:hAnsi="Arial" w:eastAsia="宋体"/>
+                <w:color w:val="000000"/>
+                <w:sz w:val="18"/>
+              </w:rPr>
+              <w:t>生成文章、摘要、CSV 和 HTML</w:t>
+            </w:r>
+          </w:p>
+        </w:tc>
+      </w:tr>
+      <w:tr>
+        <w:tc>
+          <w:tcPr>
+            <w:tcW w:type="dxa" w:w="1247"/>
+            <w:vAlign w:val="center"/>
+            <w:tcMar>
+              <w:top w:w="100" w:type="dxa"/>
+              <w:start w:w="120" w:type="dxa"/>
+              <w:bottom w:w="100" w:type="dxa"/>
+              <w:end w:w="120" w:type="dxa"/>
+            </w:tcMar>
+          </w:tcPr>
+          <w:p>
+            <w:pPr>
+              <w:jc w:val="center"/>
+            </w:pPr>
+            <w:r>
+              <w:rPr>
+                <w:rFonts w:ascii="Arial" w:hAnsi="Arial" w:eastAsia="宋体"/>
+                <w:color w:val="000000"/>
+                <w:sz w:val="18"/>
+              </w:rPr>
+              <w:t>7</w:t>
+            </w:r>
+          </w:p>
+        </w:tc>
+        <w:tc>
+          <w:tcPr>
+            <w:tcW w:type="dxa" w:w="2948"/>
+            <w:vAlign w:val="center"/>
+            <w:tcMar>
+              <w:top w:w="100" w:type="dxa"/>
+              <w:start w:w="120" w:type="dxa"/>
+              <w:bottom w:w="100" w:type="dxa"/>
+              <w:end w:w="120" w:type="dxa"/>
+            </w:tcMar>
+          </w:tcPr>
+          <w:p>
+            <w:pPr>
+              <w:jc w:val="left"/>
+            </w:pPr>
+            <w:r>
+              <w:rPr>
+                <w:rFonts w:ascii="Arial" w:hAnsi="Arial" w:eastAsia="宋体"/>
+                <w:color w:val="000000"/>
+                <w:sz w:val="18"/>
+              </w:rPr>
+              <w:t>完整离线演示</w:t>
+            </w:r>
+          </w:p>
+        </w:tc>
+        <w:tc>
+          <w:tcPr>
+            <w:tcW w:type="dxa" w:w="4706"/>
+            <w:vAlign w:val="center"/>
+            <w:tcMar>
+              <w:top w:w="100" w:type="dxa"/>
+              <w:start w:w="120" w:type="dxa"/>
+              <w:bottom w:w="100" w:type="dxa"/>
+              <w:end w:w="120" w:type="dxa"/>
+            </w:tcMar>
+          </w:tcPr>
+          <w:p>
+            <w:pPr>
+              <w:jc w:val="left"/>
+            </w:pPr>
+            <w:r>
+              <w:rPr>
+                <w:rFonts w:ascii="Arial" w:hAnsi="Arial" w:eastAsia="宋体"/>
+                <w:color w:val="000000"/>
+                <w:sz w:val="18"/>
+              </w:rPr>
+              <w:t>生成三个学段示例及报告</w:t>
+            </w:r>
+          </w:p>
+        </w:tc>
+      </w:tr>
+      <w:tr>
+        <w:tc>
+          <w:tcPr>
+            <w:tcW w:type="dxa" w:w="1247"/>
+            <w:shd w:fill="F2F6FA"/>
+            <w:vAlign w:val="center"/>
+            <w:tcMar>
+              <w:top w:w="100" w:type="dxa"/>
+              <w:start w:w="120" w:type="dxa"/>
+              <w:bottom w:w="100" w:type="dxa"/>
+              <w:end w:w="120" w:type="dxa"/>
+            </w:tcMar>
+          </w:tcPr>
+          <w:p>
+            <w:pPr>
+              <w:jc w:val="center"/>
+            </w:pPr>
+            <w:r>
+              <w:rPr>
+                <w:rFonts w:ascii="Arial" w:hAnsi="Arial" w:eastAsia="宋体"/>
+                <w:color w:val="000000"/>
+                <w:sz w:val="18"/>
+              </w:rPr>
+              <w:t>8</w:t>
+            </w:r>
+          </w:p>
+        </w:tc>
+        <w:tc>
+          <w:tcPr>
+            <w:tcW w:type="dxa" w:w="2948"/>
+            <w:shd w:fill="F2F6FA"/>
+            <w:vAlign w:val="center"/>
+            <w:tcMar>
+              <w:top w:w="100" w:type="dxa"/>
+              <w:start w:w="120" w:type="dxa"/>
+              <w:bottom w:w="100" w:type="dxa"/>
+              <w:end w:w="120" w:type="dxa"/>
+            </w:tcMar>
+          </w:tcPr>
+          <w:p>
+            <w:pPr>
+              <w:jc w:val="left"/>
+            </w:pPr>
+            <w:r>
+              <w:rPr>
+                <w:rFonts w:ascii="Arial" w:hAnsi="Arial" w:eastAsia="宋体"/>
+                <w:color w:val="000000"/>
+                <w:sz w:val="18"/>
+              </w:rPr>
+              <w:t>本地基础模型生成</w:t>
+            </w:r>
+          </w:p>
+        </w:tc>
+        <w:tc>
+          <w:tcPr>
+            <w:tcW w:type="dxa" w:w="4706"/>
+            <w:shd w:fill="F2F6FA"/>
+            <w:vAlign w:val="center"/>
+            <w:tcMar>
+              <w:top w:w="100" w:type="dxa"/>
+              <w:start w:w="120" w:type="dxa"/>
+              <w:bottom w:w="100" w:type="dxa"/>
+              <w:end w:w="120" w:type="dxa"/>
+            </w:tcMar>
+          </w:tcPr>
+          <w:p>
+            <w:pPr>
+              <w:jc w:val="left"/>
+            </w:pPr>
+            <w:r>
+              <w:rPr>
+                <w:rFonts w:ascii="Arial" w:hAnsi="Arial" w:eastAsia="宋体"/>
+                <w:color w:val="000000"/>
+                <w:sz w:val="18"/>
+              </w:rPr>
+              <w:t>Qwen3 输出非空正文</w:t>
+            </w:r>
+          </w:p>
+        </w:tc>
+      </w:tr>
+      <w:tr>
+        <w:tc>
+          <w:tcPr>
+            <w:tcW w:type="dxa" w:w="1247"/>
+            <w:vAlign w:val="center"/>
+            <w:tcMar>
+              <w:top w:w="100" w:type="dxa"/>
+              <w:start w:w="120" w:type="dxa"/>
+              <w:bottom w:w="100" w:type="dxa"/>
+              <w:end w:w="120" w:type="dxa"/>
+            </w:tcMar>
+          </w:tcPr>
+          <w:p>
+            <w:pPr>
+              <w:jc w:val="center"/>
+            </w:pPr>
+            <w:r>
+              <w:rPr>
+                <w:rFonts w:ascii="Arial" w:hAnsi="Arial" w:eastAsia="宋体"/>
+                <w:color w:val="000000"/>
+                <w:sz w:val="18"/>
+              </w:rPr>
+              <w:t>9</w:t>
+            </w:r>
+          </w:p>
+        </w:tc>
+        <w:tc>
+          <w:tcPr>
+            <w:tcW w:type="dxa" w:w="2948"/>
+            <w:vAlign w:val="center"/>
+            <w:tcMar>
+              <w:top w:w="100" w:type="dxa"/>
+              <w:start w:w="120" w:type="dxa"/>
+              <w:bottom w:w="100" w:type="dxa"/>
+              <w:end w:w="120" w:type="dxa"/>
+            </w:tcMar>
+          </w:tcPr>
+          <w:p>
+            <w:pPr>
+              <w:jc w:val="left"/>
+            </w:pPr>
+            <w:r>
+              <w:rPr>
+                <w:rFonts w:ascii="Arial" w:hAnsi="Arial" w:eastAsia="宋体"/>
+                <w:color w:val="000000"/>
+                <w:sz w:val="18"/>
+              </w:rPr>
+              <w:t>LoRA 冒烟微调</w:t>
+            </w:r>
+          </w:p>
+        </w:tc>
+        <w:tc>
+          <w:tcPr>
+            <w:tcW w:type="dxa" w:w="4706"/>
+            <w:vAlign w:val="center"/>
+            <w:tcMar>
+              <w:top w:w="100" w:type="dxa"/>
+              <w:start w:w="120" w:type="dxa"/>
+              <w:bottom w:w="100" w:type="dxa"/>
+              <w:end w:w="120" w:type="dxa"/>
+            </w:tcMar>
+          </w:tcPr>
+          <w:p>
+            <w:pPr>
+              <w:jc w:val="left"/>
+            </w:pPr>
+            <w:r>
+              <w:rPr>
+                <w:rFonts w:ascii="Arial" w:hAnsi="Arial" w:eastAsia="宋体"/>
+                <w:color w:val="000000"/>
+                <w:sz w:val="18"/>
+              </w:rPr>
+              <w:t>适配器配置和权重成功保存</w:t>
+            </w:r>
+          </w:p>
+        </w:tc>
+      </w:tr>
+      <w:tr>
+        <w:tc>
+          <w:tcPr>
+            <w:tcW w:type="dxa" w:w="1247"/>
+            <w:shd w:fill="F2F6FA"/>
+            <w:vAlign w:val="center"/>
+            <w:tcMar>
+              <w:top w:w="100" w:type="dxa"/>
+              <w:start w:w="120" w:type="dxa"/>
+              <w:bottom w:w="100" w:type="dxa"/>
+              <w:end w:w="120" w:type="dxa"/>
+            </w:tcMar>
+          </w:tcPr>
+          <w:p>
+            <w:pPr>
+              <w:jc w:val="center"/>
+            </w:pPr>
+            <w:r>
+              <w:rPr>
+                <w:rFonts w:ascii="Arial" w:hAnsi="Arial" w:eastAsia="宋体"/>
+                <w:color w:val="000000"/>
+                <w:sz w:val="18"/>
+              </w:rPr>
+              <w:t>10</w:t>
+            </w:r>
+          </w:p>
+        </w:tc>
+        <w:tc>
+          <w:tcPr>
+            <w:tcW w:type="dxa" w:w="2948"/>
+            <w:shd w:fill="F2F6FA"/>
+            <w:vAlign w:val="center"/>
+            <w:tcMar>
+              <w:top w:w="100" w:type="dxa"/>
+              <w:start w:w="120" w:type="dxa"/>
+              <w:bottom w:w="100" w:type="dxa"/>
+              <w:end w:w="120" w:type="dxa"/>
+            </w:tcMar>
+          </w:tcPr>
+          <w:p>
+            <w:pPr>
+              <w:jc w:val="left"/>
+            </w:pPr>
+            <w:r>
+              <w:rPr>
+                <w:rFonts w:ascii="Arial" w:hAnsi="Arial" w:eastAsia="宋体"/>
+                <w:color w:val="000000"/>
+                <w:sz w:val="18"/>
+              </w:rPr>
+              <w:t>LoRA 适配器生成</w:t>
+            </w:r>
+          </w:p>
+        </w:tc>
+        <w:tc>
+          <w:tcPr>
+            <w:tcW w:type="dxa" w:w="4706"/>
+            <w:shd w:fill="F2F6FA"/>
+            <w:vAlign w:val="center"/>
+            <w:tcMar>
+              <w:top w:w="100" w:type="dxa"/>
+              <w:start w:w="120" w:type="dxa"/>
+              <w:bottom w:w="100" w:type="dxa"/>
+              <w:end w:w="120" w:type="dxa"/>
+            </w:tcMar>
+          </w:tcPr>
+          <w:p>
+            <w:pPr>
+              <w:jc w:val="left"/>
+            </w:pPr>
+            <w:r>
+              <w:rPr>
+                <w:rFonts w:ascii="Arial" w:hAnsi="Arial" w:eastAsia="宋体"/>
+                <w:color w:val="000000"/>
+                <w:sz w:val="18"/>
+              </w:rPr>
+              <w:t>挂载适配器后输出非空正文</w:t>
+            </w:r>
+          </w:p>
+        </w:tc>
+      </w:tr>
+    </w:tbl>
+    <w:p/>
+    <w:p>
+      <w:pPr>
+        <w:ind w:firstLine="420"/>
+      </w:pPr>
+      <w:r>
+        <w:rPr>
+          <w:rFonts w:ascii="Arial" w:hAnsi="Arial" w:eastAsia="宋体"/>
+          <w:color w:val="000000"/>
+          <w:sz w:val="21"/>
+        </w:rPr>
+        <w:t>只检查不依赖大模型的基础功能时使用 python scripts/one_click_test.py --skip-llm。需要改变部署位置时，可传入 --project-root、--model-path 和 --device。所有结果位于 test_output/one_click_时间戳，脚本整体通过时退出码为 0。</w:t>
+      </w:r>
+    </w:p>
+    <w:p>
+      <w:pPr>
+        <w:pStyle w:val="Heading1"/>
+        <w:keepNext/>
+      </w:pPr>
+      <w:r>
+        <w:t>12 Notebook 分批测试</w:t>
+      </w:r>
+    </w:p>
+    <w:p>
+      <w:pPr>
+        <w:ind w:firstLine="420"/>
+      </w:pPr>
+      <w:r>
+        <w:rPr>
+          <w:rFonts w:ascii="Arial" w:hAnsi="Arial" w:eastAsia="宋体"/>
+          <w:color w:val="000000"/>
+          <w:sz w:val="21"/>
+        </w:rPr>
+        <w:t>notebooks/llmctg_function_test.ipynb 适合交互式验收。Notebook 把测试拆分为初始化、基础功能、生成评估、批处理、基础模型推理、LoRA 训练和 LoRA 推理等单元，每个单元都列出预期结果并通过 assert 自动判定关键输出。</w:t>
+      </w:r>
+    </w:p>
+    <w:p>
+      <w:pPr>
+        <w:spacing w:after="0" w:line="240" w:lineRule="auto"/>
+        <w:ind w:left="454"/>
+      </w:pPr>
+      <w:r>
+        <w:rPr>
+          <w:rFonts w:ascii="Consolas" w:hAnsi="Consolas" w:eastAsia="等线"/>
+          <w:color w:val="000000"/>
+          <w:sz w:val="18"/>
+        </w:rPr>
+        <w:t>cd /home/wangzy/workplace/wyc/llmctg</w:t>
+      </w:r>
+    </w:p>
+    <w:p>
+      <w:pPr>
+        <w:spacing w:after="0" w:line="240" w:lineRule="auto"/>
+        <w:ind w:left="454"/>
+      </w:pPr>
+      <w:r>
+        <w:rPr>
+          <w:rFonts w:ascii="Consolas" w:hAnsi="Consolas" w:eastAsia="等线"/>
+          <w:color w:val="000000"/>
+          <w:sz w:val="18"/>
+        </w:rPr>
+        <w:t>jupyter notebook notebooks/llmctg_function_test.ipynb</w:t>
+      </w:r>
+    </w:p>
+    <w:p>
+      <w:pPr>
+        <w:ind w:left="454" w:hanging="340"/>
+      </w:pPr>
+      <w:r>
+        <w:rPr>
+          <w:rFonts w:ascii="Arial" w:hAnsi="Arial" w:eastAsia="宋体"/>
+          <w:b/>
+          <w:color w:val="000000"/>
+          <w:sz w:val="21"/>
+        </w:rPr>
+        <w:t xml:space="preserve">1. </w:t>
+      </w:r>
+      <w:r>
+        <w:rPr>
+          <w:rFonts w:ascii="Arial" w:hAnsi="Arial" w:eastAsia="宋体"/>
+          <w:color w:val="000000"/>
+          <w:sz w:val="21"/>
+        </w:rPr>
+        <w:t>选择安装 llmctg 及其模型扩展依赖的 Python 内核。</w:t>
+      </w:r>
+    </w:p>
+    <w:p>
+      <w:pPr>
+        <w:ind w:left="454" w:hanging="340"/>
+      </w:pPr>
+      <w:r>
+        <w:rPr>
+          <w:rFonts w:ascii="Arial" w:hAnsi="Arial" w:eastAsia="宋体"/>
+          <w:b/>
+          <w:color w:val="000000"/>
+          <w:sz w:val="21"/>
+        </w:rPr>
+        <w:t xml:space="preserve">2. </w:t>
+      </w:r>
+      <w:r>
+        <w:rPr>
+          <w:rFonts w:ascii="Arial" w:hAnsi="Arial" w:eastAsia="宋体"/>
+          <w:color w:val="000000"/>
+          <w:sz w:val="21"/>
+        </w:rPr>
+        <w:t>先运行初始化单元，核对 PROJECT_ROOT、MODEL_PATH、DEVICE 和 OUTPUT_ROOT。</w:t>
+      </w:r>
+    </w:p>
+    <w:p>
+      <w:pPr>
+        <w:ind w:left="454" w:hanging="340"/>
+      </w:pPr>
+      <w:r>
+        <w:rPr>
+          <w:rFonts w:ascii="Arial" w:hAnsi="Arial" w:eastAsia="宋体"/>
+          <w:b/>
+          <w:color w:val="000000"/>
+          <w:sz w:val="21"/>
+        </w:rPr>
+        <w:t xml:space="preserve">3. </w:t>
+      </w:r>
+      <w:r>
+        <w:rPr>
+          <w:rFonts w:ascii="Arial" w:hAnsi="Arial" w:eastAsia="宋体"/>
+          <w:color w:val="000000"/>
+          <w:sz w:val="21"/>
+        </w:rPr>
+        <w:t>按从上到下的顺序运行；后续训练和 LoRA 单元依赖前面生成的 TRAIN_FILE 与 ADAPTER_PATH。</w:t>
+      </w:r>
+    </w:p>
+    <w:p>
+      <w:pPr>
+        <w:ind w:left="454" w:hanging="340"/>
+      </w:pPr>
+      <w:r>
+        <w:rPr>
+          <w:rFonts w:ascii="Arial" w:hAnsi="Arial" w:eastAsia="宋体"/>
+          <w:b/>
+          <w:color w:val="000000"/>
+          <w:sz w:val="21"/>
+        </w:rPr>
+        <w:t xml:space="preserve">4. </w:t>
+      </w:r>
+      <w:r>
+        <w:rPr>
+          <w:rFonts w:ascii="Arial" w:hAnsi="Arial" w:eastAsia="宋体"/>
+          <w:color w:val="000000"/>
+          <w:sz w:val="21"/>
+        </w:rPr>
+        <w:t>观察单元末尾是否显示 PASS；若 assert 失败，从当前单元的命令输出定位问题。</w:t>
+      </w:r>
+    </w:p>
+    <w:p>
+      <w:pPr>
+        <w:ind w:left="454" w:hanging="340"/>
+      </w:pPr>
+      <w:r>
+        <w:rPr>
+          <w:rFonts w:ascii="Arial" w:hAnsi="Arial" w:eastAsia="宋体"/>
+          <w:b/>
+          <w:color w:val="000000"/>
+          <w:sz w:val="21"/>
+        </w:rPr>
+        <w:t xml:space="preserve">5. </w:t>
+      </w:r>
+      <w:r>
+        <w:rPr>
+          <w:rFonts w:ascii="Arial" w:hAnsi="Arial" w:eastAsia="宋体"/>
+          <w:color w:val="000000"/>
+          <w:sz w:val="21"/>
+        </w:rPr>
+        <w:t>训练时可同时打开 nvitop，确认只有指定 GPU 被当前进程使用。</w:t>
+      </w:r>
+    </w:p>
+    <w:p>
+      <w:pPr>
+        <w:pStyle w:val="Heading1"/>
+        <w:keepNext/>
+      </w:pPr>
+      <w:r>
+        <w:t>13 常见问题与故障处理</w:t>
       </w:r>
     </w:p>
     <w:tbl>
@@ -4182,6 +6993,59 @@
                 <w:color w:val="000000"/>
                 <w:sz w:val="18"/>
               </w:rPr>
+              <w:t>invalid choice: 城市河流</w:t>
+            </w:r>
+          </w:p>
+        </w:tc>
+        <w:tc>
+          <w:tcPr>
+            <w:tcW w:type="dxa" w:w="5953"/>
+            <w:vAlign w:val="center"/>
+            <w:tcMar>
+              <w:top w:w="100" w:type="dxa"/>
+              <w:start w:w="120" w:type="dxa"/>
+              <w:bottom w:w="100" w:type="dxa"/>
+              <w:end w:w="120" w:type="dxa"/>
+            </w:tcMar>
+          </w:tcPr>
+          <w:p>
+            <w:pPr>
+              <w:jc w:val="left"/>
+            </w:pPr>
+            <w:r>
+              <w:rPr>
+                <w:rFonts w:ascii="Arial" w:hAnsi="Arial" w:eastAsia="宋体"/>
+                <w:color w:val="000000"/>
+                <w:sz w:val="18"/>
+              </w:rPr>
+              <w:t>generate 子命令缺失或参数顺序错误；应先写 llmctg generate，再写 --topic</w:t>
+            </w:r>
+          </w:p>
+        </w:tc>
+      </w:tr>
+      <w:tr>
+        <w:tc>
+          <w:tcPr>
+            <w:tcW w:type="dxa" w:w="2948"/>
+            <w:shd w:fill="F2F6FA"/>
+            <w:vAlign w:val="center"/>
+            <w:tcMar>
+              <w:top w:w="100" w:type="dxa"/>
+              <w:start w:w="120" w:type="dxa"/>
+              <w:bottom w:w="100" w:type="dxa"/>
+              <w:end w:w="120" w:type="dxa"/>
+            </w:tcMar>
+          </w:tcPr>
+          <w:p>
+            <w:pPr>
+              <w:jc w:val="center"/>
+            </w:pPr>
+            <w:r>
+              <w:rPr>
+                <w:rFonts w:ascii="Arial" w:hAnsi="Arial" w:eastAsia="宋体"/>
+                <w:color w:val="000000"/>
+                <w:sz w:val="18"/>
+              </w:rPr>
               <w:t>提示主题不能为空</w:t>
             </w:r>
           </w:p>
@@ -4189,6 +7053,7 @@
         <w:tc>
           <w:tcPr>
             <w:tcW w:type="dxa" w:w="5953"/>
+            <w:shd w:fill="F2F6FA"/>
             <w:vAlign w:val="center"/>
             <w:tcMar>
               <w:top w:w="100" w:type="dxa"/>
@@ -4216,7 +7081,6 @@
         <w:tc>
           <w:tcPr>
             <w:tcW w:type="dxa" w:w="2948"/>
-            <w:shd w:fill="F2F6FA"/>
             <w:vAlign w:val="center"/>
             <w:tcMar>
               <w:top w:w="100" w:type="dxa"/>
@@ -4242,7 +7106,6 @@
         <w:tc>
           <w:tcPr>
             <w:tcW w:type="dxa" w:w="5953"/>
-            <w:shd w:fill="F2F6FA"/>
             <w:vAlign w:val="center"/>
             <w:tcMar>
               <w:top w:w="100" w:type="dxa"/>
@@ -4270,6 +7133,7 @@
         <w:tc>
           <w:tcPr>
             <w:tcW w:type="dxa" w:w="2948"/>
+            <w:shd w:fill="F2F6FA"/>
             <w:vAlign w:val="center"/>
             <w:tcMar>
               <w:top w:w="100" w:type="dxa"/>
@@ -4295,6 +7159,7 @@
         <w:tc>
           <w:tcPr>
             <w:tcW w:type="dxa" w:w="5953"/>
+            <w:shd w:fill="F2F6FA"/>
             <w:vAlign w:val="center"/>
             <w:tcMar>
               <w:top w:w="100" w:type="dxa"/>
@@ -4322,7 +7187,6 @@
         <w:tc>
           <w:tcPr>
             <w:tcW w:type="dxa" w:w="2948"/>
-            <w:shd w:fill="F2F6FA"/>
             <w:vAlign w:val="center"/>
             <w:tcMar>
               <w:top w:w="100" w:type="dxa"/>
@@ -4348,7 +7212,6 @@
         <w:tc>
           <w:tcPr>
             <w:tcW w:type="dxa" w:w="5953"/>
-            <w:shd w:fill="F2F6FA"/>
             <w:vAlign w:val="center"/>
             <w:tcMar>
               <w:top w:w="100" w:type="dxa"/>
@@ -4376,6 +7239,7 @@
         <w:tc>
           <w:tcPr>
             <w:tcW w:type="dxa" w:w="2948"/>
+            <w:shd w:fill="F2F6FA"/>
             <w:vAlign w:val="center"/>
             <w:tcMar>
               <w:top w:w="100" w:type="dxa"/>
@@ -4394,7 +7258,60 @@
                 <w:color w:val="000000"/>
                 <w:sz w:val="18"/>
               </w:rPr>
-              <w:t>CUDA 显存不足</w:t>
+              <w:t>NVIDIA driver is too old</w:t>
+            </w:r>
+          </w:p>
+        </w:tc>
+        <w:tc>
+          <w:tcPr>
+            <w:tcW w:type="dxa" w:w="5953"/>
+            <w:shd w:fill="F2F6FA"/>
+            <w:vAlign w:val="center"/>
+            <w:tcMar>
+              <w:top w:w="100" w:type="dxa"/>
+              <w:start w:w="120" w:type="dxa"/>
+              <w:bottom w:w="100" w:type="dxa"/>
+              <w:end w:w="120" w:type="dxa"/>
+            </w:tcMar>
+          </w:tcPr>
+          <w:p>
+            <w:pPr>
+              <w:jc w:val="left"/>
+            </w:pPr>
+            <w:r>
+              <w:rPr>
+                <w:rFonts w:ascii="Arial" w:hAnsi="Arial" w:eastAsia="宋体"/>
+                <w:color w:val="000000"/>
+                <w:sz w:val="18"/>
+              </w:rPr>
+              <w:t>安装与驱动兼容的 PyTorch CUDA 构建，或由管理员升级驱动；先核对 torch.version.cuda</w:t>
+            </w:r>
+          </w:p>
+        </w:tc>
+      </w:tr>
+      <w:tr>
+        <w:tc>
+          <w:tcPr>
+            <w:tcW w:type="dxa" w:w="2948"/>
+            <w:vAlign w:val="center"/>
+            <w:tcMar>
+              <w:top w:w="100" w:type="dxa"/>
+              <w:start w:w="120" w:type="dxa"/>
+              <w:bottom w:w="100" w:type="dxa"/>
+              <w:end w:w="120" w:type="dxa"/>
+            </w:tcMar>
+          </w:tcPr>
+          <w:p>
+            <w:pPr>
+              <w:jc w:val="center"/>
+            </w:pPr>
+            <w:r>
+              <w:rPr>
+                <w:rFonts w:ascii="Arial" w:hAnsi="Arial" w:eastAsia="宋体"/>
+                <w:color w:val="000000"/>
+                <w:sz w:val="18"/>
+              </w:rPr>
+              <w:t>model_kwargs 包含 generator</w:t>
             </w:r>
           </w:p>
         </w:tc>
@@ -4419,7 +7336,7 @@
                 <w:color w:val="000000"/>
                 <w:sz w:val="18"/>
               </w:rPr>
-              <w:t>降低最大令牌数、使用更小模型或改用 CPU</w:t>
+              <w:t>更新到已移除 generator 参数的当前版本，再执行 pip install -e .</w:t>
             </w:r>
           </w:p>
         </w:tc>
@@ -4447,6 +7364,271 @@
                 <w:color w:val="000000"/>
                 <w:sz w:val="18"/>
               </w:rPr>
+              <w:t>TrainingArguments 参数不兼容</w:t>
+            </w:r>
+          </w:p>
+        </w:tc>
+        <w:tc>
+          <w:tcPr>
+            <w:tcW w:type="dxa" w:w="5953"/>
+            <w:shd w:fill="F2F6FA"/>
+            <w:vAlign w:val="center"/>
+            <w:tcMar>
+              <w:top w:w="100" w:type="dxa"/>
+              <w:start w:w="120" w:type="dxa"/>
+              <w:bottom w:w="100" w:type="dxa"/>
+              <w:end w:w="120" w:type="dxa"/>
+            </w:tcMar>
+          </w:tcPr>
+          <w:p>
+            <w:pPr>
+              <w:jc w:val="left"/>
+            </w:pPr>
+            <w:r>
+              <w:rPr>
+                <w:rFonts w:ascii="Arial" w:hAnsi="Arial" w:eastAsia="宋体"/>
+                <w:color w:val="000000"/>
+                <w:sz w:val="18"/>
+              </w:rPr>
+              <w:t>更新当前代码；系统会按已安装 Transformers 的签名筛选可用参数</w:t>
+            </w:r>
+          </w:p>
+        </w:tc>
+      </w:tr>
+      <w:tr>
+        <w:tc>
+          <w:tcPr>
+            <w:tcW w:type="dxa" w:w="2948"/>
+            <w:vAlign w:val="center"/>
+            <w:tcMar>
+              <w:top w:w="100" w:type="dxa"/>
+              <w:start w:w="120" w:type="dxa"/>
+              <w:bottom w:w="100" w:type="dxa"/>
+              <w:end w:w="120" w:type="dxa"/>
+            </w:tcMar>
+          </w:tcPr>
+          <w:p>
+            <w:pPr>
+              <w:jc w:val="center"/>
+            </w:pPr>
+            <w:r>
+              <w:rPr>
+                <w:rFonts w:ascii="Arial" w:hAnsi="Arial" w:eastAsia="宋体"/>
+                <w:color w:val="000000"/>
+                <w:sz w:val="18"/>
+              </w:rPr>
+              <w:t>Unable to create tensor</w:t>
+            </w:r>
+          </w:p>
+        </w:tc>
+        <w:tc>
+          <w:tcPr>
+            <w:tcW w:type="dxa" w:w="5953"/>
+            <w:vAlign w:val="center"/>
+            <w:tcMar>
+              <w:top w:w="100" w:type="dxa"/>
+              <w:start w:w="120" w:type="dxa"/>
+              <w:bottom w:w="100" w:type="dxa"/>
+              <w:end w:w="120" w:type="dxa"/>
+            </w:tcMar>
+          </w:tcPr>
+          <w:p>
+            <w:pPr>
+              <w:jc w:val="left"/>
+            </w:pPr>
+            <w:r>
+              <w:rPr>
+                <w:rFonts w:ascii="Arial" w:hAnsi="Arial" w:eastAsia="宋体"/>
+                <w:color w:val="000000"/>
+                <w:sz w:val="18"/>
+              </w:rPr>
+              <w:t>更新当前代码；训练标签应由支持动态 padding 的数据整理器生成</w:t>
+            </w:r>
+          </w:p>
+        </w:tc>
+      </w:tr>
+      <w:tr>
+        <w:tc>
+          <w:tcPr>
+            <w:tcW w:type="dxa" w:w="2948"/>
+            <w:shd w:fill="F2F6FA"/>
+            <w:vAlign w:val="center"/>
+            <w:tcMar>
+              <w:top w:w="100" w:type="dxa"/>
+              <w:start w:w="120" w:type="dxa"/>
+              <w:bottom w:w="100" w:type="dxa"/>
+              <w:end w:w="120" w:type="dxa"/>
+            </w:tcMar>
+          </w:tcPr>
+          <w:p>
+            <w:pPr>
+              <w:jc w:val="center"/>
+            </w:pPr>
+            <w:r>
+              <w:rPr>
+                <w:rFonts w:ascii="Arial" w:hAnsi="Arial" w:eastAsia="宋体"/>
+                <w:color w:val="000000"/>
+                <w:sz w:val="18"/>
+              </w:rPr>
+              <w:t>训练只有 1 步且很慢</w:t>
+            </w:r>
+          </w:p>
+        </w:tc>
+        <w:tc>
+          <w:tcPr>
+            <w:tcW w:type="dxa" w:w="5953"/>
+            <w:shd w:fill="F2F6FA"/>
+            <w:vAlign w:val="center"/>
+            <w:tcMar>
+              <w:top w:w="100" w:type="dxa"/>
+              <w:start w:w="120" w:type="dxa"/>
+              <w:bottom w:w="100" w:type="dxa"/>
+              <w:end w:w="120" w:type="dxa"/>
+            </w:tcMar>
+          </w:tcPr>
+          <w:p>
+            <w:pPr>
+              <w:jc w:val="left"/>
+            </w:pPr>
+            <w:r>
+              <w:rPr>
+                <w:rFonts w:ascii="Arial" w:hAnsi="Arial" w:eastAsia="宋体"/>
+                <w:color w:val="000000"/>
+                <w:sz w:val="18"/>
+              </w:rPr>
+              <w:t>可能自动使用多卡；用 CUDA_VISIBLE_DEVICES=0 限制单卡后重试</w:t>
+            </w:r>
+          </w:p>
+        </w:tc>
+      </w:tr>
+      <w:tr>
+        <w:tc>
+          <w:tcPr>
+            <w:tcW w:type="dxa" w:w="2948"/>
+            <w:vAlign w:val="center"/>
+            <w:tcMar>
+              <w:top w:w="100" w:type="dxa"/>
+              <w:start w:w="120" w:type="dxa"/>
+              <w:bottom w:w="100" w:type="dxa"/>
+              <w:end w:w="120" w:type="dxa"/>
+            </w:tcMar>
+          </w:tcPr>
+          <w:p>
+            <w:pPr>
+              <w:jc w:val="center"/>
+            </w:pPr>
+            <w:r>
+              <w:rPr>
+                <w:rFonts w:ascii="Arial" w:hAnsi="Arial" w:eastAsia="宋体"/>
+                <w:color w:val="000000"/>
+                <w:sz w:val="18"/>
+              </w:rPr>
+              <w:t>找不到 adapter_config.json</w:t>
+            </w:r>
+          </w:p>
+        </w:tc>
+        <w:tc>
+          <w:tcPr>
+            <w:tcW w:type="dxa" w:w="5953"/>
+            <w:vAlign w:val="center"/>
+            <w:tcMar>
+              <w:top w:w="100" w:type="dxa"/>
+              <w:start w:w="120" w:type="dxa"/>
+              <w:bottom w:w="100" w:type="dxa"/>
+              <w:end w:w="120" w:type="dxa"/>
+            </w:tcMar>
+          </w:tcPr>
+          <w:p>
+            <w:pPr>
+              <w:jc w:val="left"/>
+            </w:pPr>
+            <w:r>
+              <w:rPr>
+                <w:rFonts w:ascii="Arial" w:hAnsi="Arial" w:eastAsia="宋体"/>
+                <w:color w:val="000000"/>
+                <w:sz w:val="18"/>
+              </w:rPr>
+              <w:t>--lora-path 必须指向完整适配器目录，不能指向基础模型或单个权重文件</w:t>
+            </w:r>
+          </w:p>
+        </w:tc>
+      </w:tr>
+      <w:tr>
+        <w:tc>
+          <w:tcPr>
+            <w:tcW w:type="dxa" w:w="2948"/>
+            <w:shd w:fill="F2F6FA"/>
+            <w:vAlign w:val="center"/>
+            <w:tcMar>
+              <w:top w:w="100" w:type="dxa"/>
+              <w:start w:w="120" w:type="dxa"/>
+              <w:bottom w:w="100" w:type="dxa"/>
+              <w:end w:w="120" w:type="dxa"/>
+            </w:tcMar>
+          </w:tcPr>
+          <w:p>
+            <w:pPr>
+              <w:jc w:val="center"/>
+            </w:pPr>
+            <w:r>
+              <w:rPr>
+                <w:rFonts w:ascii="Arial" w:hAnsi="Arial" w:eastAsia="宋体"/>
+                <w:color w:val="000000"/>
+                <w:sz w:val="18"/>
+              </w:rPr>
+              <w:t>CUDA 显存不足</w:t>
+            </w:r>
+          </w:p>
+        </w:tc>
+        <w:tc>
+          <w:tcPr>
+            <w:tcW w:type="dxa" w:w="5953"/>
+            <w:shd w:fill="F2F6FA"/>
+            <w:vAlign w:val="center"/>
+            <w:tcMar>
+              <w:top w:w="100" w:type="dxa"/>
+              <w:start w:w="120" w:type="dxa"/>
+              <w:bottom w:w="100" w:type="dxa"/>
+              <w:end w:w="120" w:type="dxa"/>
+            </w:tcMar>
+          </w:tcPr>
+          <w:p>
+            <w:pPr>
+              <w:jc w:val="left"/>
+            </w:pPr>
+            <w:r>
+              <w:rPr>
+                <w:rFonts w:ascii="Arial" w:hAnsi="Arial" w:eastAsia="宋体"/>
+                <w:color w:val="000000"/>
+                <w:sz w:val="18"/>
+              </w:rPr>
+              <w:t>降低 max-length、使用更小模型、减少批量大小或改用 CPU</w:t>
+            </w:r>
+          </w:p>
+        </w:tc>
+      </w:tr>
+      <w:tr>
+        <w:tc>
+          <w:tcPr>
+            <w:tcW w:type="dxa" w:w="2948"/>
+            <w:vAlign w:val="center"/>
+            <w:tcMar>
+              <w:top w:w="100" w:type="dxa"/>
+              <w:start w:w="120" w:type="dxa"/>
+              <w:bottom w:w="100" w:type="dxa"/>
+              <w:end w:w="120" w:type="dxa"/>
+            </w:tcMar>
+          </w:tcPr>
+          <w:p>
+            <w:pPr>
+              <w:jc w:val="center"/>
+            </w:pPr>
+            <w:r>
+              <w:rPr>
+                <w:rFonts w:ascii="Arial" w:hAnsi="Arial" w:eastAsia="宋体"/>
+                <w:color w:val="000000"/>
+                <w:sz w:val="18"/>
+              </w:rPr>
               <w:t>批量任务部分失败</w:t>
             </w:r>
           </w:p>
@@ -4454,7 +7636,6 @@
         <w:tc>
           <w:tcPr>
             <w:tcW w:type="dxa" w:w="5953"/>
-            <w:shd w:fill="F2F6FA"/>
             <w:vAlign w:val="center"/>
             <w:tcMar>
               <w:top w:w="100" w:type="dxa"/>
@@ -4482,6 +7663,7 @@
         <w:tc>
           <w:tcPr>
             <w:tcW w:type="dxa" w:w="2948"/>
+            <w:shd w:fill="F2F6FA"/>
             <w:vAlign w:val="center"/>
             <w:tcMar>
               <w:top w:w="100" w:type="dxa"/>
@@ -4507,6 +7689,7 @@
         <w:tc>
           <w:tcPr>
             <w:tcW w:type="dxa" w:w="5953"/>
+            <w:shd w:fill="F2F6FA"/>
             <w:vAlign w:val="center"/>
             <w:tcMar>
               <w:top w:w="100" w:type="dxa"/>
@@ -4534,7 +7717,6 @@
         <w:tc>
           <w:tcPr>
             <w:tcW w:type="dxa" w:w="2948"/>
-            <w:shd w:fill="F2F6FA"/>
             <w:vAlign w:val="center"/>
             <w:tcMar>
               <w:top w:w="100" w:type="dxa"/>
@@ -4560,7 +7742,6 @@
         <w:tc>
           <w:tcPr>
             <w:tcW w:type="dxa" w:w="5953"/>
-            <w:shd w:fill="F2F6FA"/>
             <w:vAlign w:val="center"/>
             <w:tcMar>
               <w:top w:w="100" w:type="dxa"/>
@@ -4592,7 +7773,7 @@
         <w:keepNext/>
       </w:pPr>
       <w:r>
-        <w:t>12 数据安全与使用边界</w:t>
+        <w:t>14 数据安全与使用边界</w:t>
       </w:r>
     </w:p>
     <w:p>
@@ -4671,7 +7852,81 @@
         <w:keepNext/>
       </w:pPr>
       <w:r>
-        <w:t>13 软件卸载</w:t>
+        <w:t>15 日常维护与卸载</w:t>
+      </w:r>
+    </w:p>
+    <w:p>
+      <w:pPr>
+        <w:pStyle w:val="Heading2"/>
+        <w:keepNext/>
+      </w:pPr>
+      <w:r>
+        <w:t>15.1 日常维护</w:t>
+      </w:r>
+    </w:p>
+    <w:p>
+      <w:pPr>
+        <w:pStyle w:val="ListBullet"/>
+        <w:ind w:left="454"/>
+      </w:pPr>
+      <w:r>
+        <w:rPr>
+          <w:rFonts w:ascii="Arial" w:hAnsi="Arial" w:eastAsia="宋体"/>
+          <w:color w:val="000000"/>
+          <w:sz w:val="21"/>
+        </w:rPr>
+        <w:t>升级代码后重新执行 python -m pip install -e .，并运行不依赖模型的快速测试。</w:t>
+      </w:r>
+    </w:p>
+    <w:p>
+      <w:pPr>
+        <w:pStyle w:val="ListBullet"/>
+        <w:ind w:left="454"/>
+      </w:pPr>
+      <w:r>
+        <w:rPr>
+          <w:rFonts w:ascii="Arial" w:hAnsi="Arial" w:eastAsia="宋体"/>
+          <w:color w:val="000000"/>
+          <w:sz w:val="21"/>
+        </w:rPr>
+        <w:t>不要把模型权重、训练检查点、环境变量文件和 test_output 提交到版本库；项目已提供 .gitignore。</w:t>
+      </w:r>
+    </w:p>
+    <w:p>
+      <w:pPr>
+        <w:pStyle w:val="ListBullet"/>
+        <w:ind w:left="454"/>
+      </w:pPr>
+      <w:r>
+        <w:rPr>
+          <w:rFonts w:ascii="Arial" w:hAnsi="Arial" w:eastAsia="宋体"/>
+          <w:color w:val="000000"/>
+          <w:sz w:val="21"/>
+        </w:rPr>
+        <w:t>定期归档正式训练的适配器、配置、数据版本和测试摘要，以便复现。</w:t>
+      </w:r>
+    </w:p>
+    <w:p>
+      <w:pPr>
+        <w:pStyle w:val="ListBullet"/>
+        <w:ind w:left="454"/>
+      </w:pPr>
+      <w:r>
+        <w:rPr>
+          <w:rFonts w:ascii="Arial" w:hAnsi="Arial" w:eastAsia="宋体"/>
+          <w:color w:val="000000"/>
+          <w:sz w:val="21"/>
+        </w:rPr>
+        <w:t>清理输出目录前先确认其中没有唯一的适配器权重或验收记录。</w:t>
+      </w:r>
+    </w:p>
+    <w:p>
+      <w:pPr>
+        <w:pStyle w:val="Heading2"/>
+        <w:keepNext/>
+      </w:pPr>
+      <w:r>
+        <w:t>15.2 软件卸载</w:t>
       </w:r>
     </w:p>
     <w:p>
@@ -4701,6 +7956,1035 @@
         <w:t>python -m pip uninstall llmctg</w:t>
       </w:r>
     </w:p>
+    <w:p>
+      <w:pPr>
+        <w:pStyle w:val="Heading1"/>
+        <w:keepNext/>
+      </w:pPr>
+      <w:r>
+        <w:t>附录 A 命令速查</w:t>
+      </w:r>
+    </w:p>
+    <w:p>
+      <w:pPr>
+        <w:spacing w:after="0" w:line="240" w:lineRule="auto"/>
+        <w:ind w:left="454"/>
+      </w:pPr>
+      <w:r>
+        <w:rPr>
+          <w:rFonts w:ascii="Consolas" w:hAnsi="Consolas" w:eastAsia="等线"/>
+          <w:color w:val="000000"/>
+          <w:sz w:val="18"/>
+        </w:rPr>
+        <w:t>llmctg --version</w:t>
+      </w:r>
+    </w:p>
+    <w:p>
+      <w:pPr>
+        <w:spacing w:after="0" w:line="240" w:lineRule="auto"/>
+        <w:ind w:left="454"/>
+      </w:pPr>
+      <w:r>
+        <w:rPr>
+          <w:rFonts w:ascii="Consolas" w:hAnsi="Consolas" w:eastAsia="等线"/>
+          <w:color w:val="000000"/>
+          <w:sz w:val="18"/>
+        </w:rPr>
+        <w:t>llmctg init-config --output llmctg.json</w:t>
+      </w:r>
+    </w:p>
+    <w:p>
+      <w:pPr>
+        <w:spacing w:after="0" w:line="240" w:lineRule="auto"/>
+        <w:ind w:left="454"/>
+      </w:pPr>
+      <w:r>
+        <w:rPr>
+          <w:rFonts w:ascii="Consolas" w:hAnsi="Consolas" w:eastAsia="等线"/>
+          <w:color w:val="000000"/>
+          <w:sz w:val="18"/>
+        </w:rPr>
+        <w:t>llmctg demo --output output/demo</w:t>
+      </w:r>
+    </w:p>
+    <w:p>
+      <w:pPr>
+        <w:spacing w:after="0" w:line="240" w:lineRule="auto"/>
+        <w:ind w:left="454"/>
+      </w:pPr>
+      <w:r>
+        <w:rPr>
+          <w:rFonts w:ascii="Consolas" w:hAnsi="Consolas" w:eastAsia="等线"/>
+          <w:color w:val="000000"/>
+          <w:sz w:val="18"/>
+        </w:rPr>
+        <w:t>llmctg generate --backend template --topic "城市河流" --level junior</w:t>
+      </w:r>
+    </w:p>
+    <w:p>
+      <w:pPr>
+        <w:spacing w:after="0" w:line="240" w:lineRule="auto"/>
+        <w:ind w:left="454"/>
+      </w:pPr>
+      <w:r>
+        <w:rPr>
+          <w:rFonts w:ascii="Consolas" w:hAnsi="Consolas" w:eastAsia="等线"/>
+          <w:color w:val="000000"/>
+          <w:sz w:val="18"/>
+        </w:rPr>
+        <w:t>llmctg evaluate --input article.txt --level junior --output evaluation.json</w:t>
+      </w:r>
+    </w:p>
+    <w:p>
+      <w:pPr>
+        <w:spacing w:after="0" w:line="240" w:lineRule="auto"/>
+        <w:ind w:left="454"/>
+      </w:pPr>
+      <w:r>
+        <w:rPr>
+          <w:rFonts w:ascii="Consolas" w:hAnsi="Consolas" w:eastAsia="等线"/>
+          <w:color w:val="000000"/>
+          <w:sz w:val="18"/>
+        </w:rPr>
+        <w:t>llmctg batch --input examples/tasks.jsonl --output output/batch --no-resume</w:t>
+      </w:r>
+    </w:p>
+    <w:p>
+      <w:pPr>
+        <w:spacing w:after="0" w:line="240" w:lineRule="auto"/>
+        <w:ind w:left="454"/>
+      </w:pPr>
+      <w:r>
+        <w:rPr>
+          <w:rFonts w:ascii="Consolas" w:hAnsi="Consolas" w:eastAsia="等线"/>
+          <w:color w:val="000000"/>
+          <w:sz w:val="18"/>
+        </w:rPr>
+        <w:t>llmctg prepare-data --input train.txt --output train.jsonl</w:t>
+      </w:r>
+    </w:p>
+    <w:p>
+      <w:pPr>
+        <w:spacing w:after="0" w:line="240" w:lineRule="auto"/>
+        <w:ind w:left="454"/>
+      </w:pPr>
+      <w:r>
+        <w:rPr>
+          <w:rFonts w:ascii="Consolas" w:hAnsi="Consolas" w:eastAsia="等线"/>
+          <w:color w:val="000000"/>
+          <w:sz w:val="18"/>
+        </w:rPr>
+        <w:t>llmctg train --model-path MODEL --dataset train.jsonl --output ADAPTER --device cuda:0</w:t>
+      </w:r>
+    </w:p>
+    <w:p>
+      <w:pPr>
+        <w:spacing w:after="0" w:line="240" w:lineRule="auto"/>
+        <w:ind w:left="454"/>
+      </w:pPr>
+      <w:r>
+        <w:rPr>
+          <w:rFonts w:ascii="Consolas" w:hAnsi="Consolas" w:eastAsia="等线"/>
+          <w:color w:val="000000"/>
+          <w:sz w:val="18"/>
+        </w:rPr>
+        <w:t>llmctg generate --backend transformers --model-path MODEL --lora-path ADAPTER --device cuda:0 --topic "城市河流"</w:t>
+      </w:r>
+    </w:p>
+    <w:p>
+      <w:pPr>
+        <w:pStyle w:val="Heading1"/>
+        <w:keepNext/>
+      </w:pPr>
+      <w:r>
+        <w:t>附录 B 验收检查表</w:t>
+      </w:r>
+    </w:p>
+    <w:tbl>
+      <w:tblPr>
+        <w:tblStyle w:val="TableGrid"/>
+        <w:tblW w:type="auto" w:w="0"/>
+        <w:jc w:val="center"/>
+        <w:tblLook w:firstColumn="1" w:firstRow="1" w:lastColumn="0" w:lastRow="0" w:noHBand="0" w:noVBand="1" w:val="04A0"/>
+      </w:tblPr>
+      <w:tblGrid>
+        <w:gridCol w:w="3135"/>
+        <w:gridCol w:w="3135"/>
+        <w:gridCol w:w="3135"/>
+      </w:tblGrid>
+      <w:tr>
+        <w:trPr>
+          <w:tblHeader/>
+        </w:trPr>
+        <w:tc>
+          <w:tcPr>
+            <w:tcW w:type="dxa" w:w="3118"/>
+            <w:shd w:fill="1F4E78"/>
+            <w:vAlign w:val="center"/>
+            <w:tcMar>
+              <w:top w:w="100" w:type="dxa"/>
+              <w:start w:w="120" w:type="dxa"/>
+              <w:bottom w:w="100" w:type="dxa"/>
+              <w:end w:w="120" w:type="dxa"/>
+            </w:tcMar>
+          </w:tcPr>
+          <w:p>
+            <w:pPr>
+              <w:jc w:val="center"/>
+            </w:pPr>
+            <w:r>
+              <w:rPr>
+                <w:rFonts w:ascii="Arial" w:hAnsi="Arial" w:eastAsia="黑体"/>
+                <w:b/>
+                <w:color w:val="FFFFFF"/>
+                <w:sz w:val="19"/>
+              </w:rPr>
+              <w:t>检查项目</w:t>
+            </w:r>
+          </w:p>
+        </w:tc>
+        <w:tc>
+          <w:tcPr>
+            <w:tcW w:type="dxa" w:w="4649"/>
+            <w:shd w:fill="1F4E78"/>
+            <w:vAlign w:val="center"/>
+            <w:tcMar>
+              <w:top w:w="100" w:type="dxa"/>
+              <w:start w:w="120" w:type="dxa"/>
+              <w:bottom w:w="100" w:type="dxa"/>
+              <w:end w:w="120" w:type="dxa"/>
+            </w:tcMar>
+          </w:tcPr>
+          <w:p>
+            <w:pPr>
+              <w:jc w:val="center"/>
+            </w:pPr>
+            <w:r>
+              <w:rPr>
+                <w:rFonts w:ascii="Arial" w:hAnsi="Arial" w:eastAsia="黑体"/>
+                <w:b/>
+                <w:color w:val="FFFFFF"/>
+                <w:sz w:val="19"/>
+              </w:rPr>
+              <w:t>合格标准</w:t>
+            </w:r>
+          </w:p>
+        </w:tc>
+        <w:tc>
+          <w:tcPr>
+            <w:tcW w:type="dxa" w:w="1134"/>
+            <w:shd w:fill="1F4E78"/>
+            <w:vAlign w:val="center"/>
+            <w:tcMar>
+              <w:top w:w="100" w:type="dxa"/>
+              <w:start w:w="120" w:type="dxa"/>
+              <w:bottom w:w="100" w:type="dxa"/>
+              <w:end w:w="120" w:type="dxa"/>
+            </w:tcMar>
+          </w:tcPr>
+          <w:p>
+            <w:pPr>
+              <w:jc w:val="center"/>
+            </w:pPr>
+            <w:r>
+              <w:rPr>
+                <w:rFonts w:ascii="Arial" w:hAnsi="Arial" w:eastAsia="黑体"/>
+                <w:b/>
+                <w:color w:val="FFFFFF"/>
+                <w:sz w:val="19"/>
+              </w:rPr>
+              <w:t>结果</w:t>
+            </w:r>
+          </w:p>
+        </w:tc>
+      </w:tr>
+      <w:tr>
+        <w:tc>
+          <w:tcPr>
+            <w:tcW w:type="dxa" w:w="3118"/>
+            <w:vAlign w:val="center"/>
+            <w:tcMar>
+              <w:top w:w="100" w:type="dxa"/>
+              <w:start w:w="120" w:type="dxa"/>
+              <w:bottom w:w="100" w:type="dxa"/>
+              <w:end w:w="120" w:type="dxa"/>
+            </w:tcMar>
+          </w:tcPr>
+          <w:p>
+            <w:pPr>
+              <w:jc w:val="center"/>
+            </w:pPr>
+            <w:r>
+              <w:rPr>
+                <w:rFonts w:ascii="Arial" w:hAnsi="Arial" w:eastAsia="宋体"/>
+                <w:color w:val="000000"/>
+                <w:sz w:val="18"/>
+              </w:rPr>
+              <w:t>安装入口</w:t>
+            </w:r>
+          </w:p>
+        </w:tc>
+        <w:tc>
+          <w:tcPr>
+            <w:tcW w:type="dxa" w:w="4649"/>
+            <w:vAlign w:val="center"/>
+            <w:tcMar>
+              <w:top w:w="100" w:type="dxa"/>
+              <w:start w:w="120" w:type="dxa"/>
+              <w:bottom w:w="100" w:type="dxa"/>
+              <w:end w:w="120" w:type="dxa"/>
+            </w:tcMar>
+          </w:tcPr>
+          <w:p>
+            <w:pPr>
+              <w:jc w:val="left"/>
+            </w:pPr>
+            <w:r>
+              <w:rPr>
+                <w:rFonts w:ascii="Arial" w:hAnsi="Arial" w:eastAsia="宋体"/>
+                <w:color w:val="000000"/>
+                <w:sz w:val="18"/>
+              </w:rPr>
+              <w:t>llmctg --version 正常返回</w:t>
+            </w:r>
+          </w:p>
+        </w:tc>
+        <w:tc>
+          <w:tcPr>
+            <w:tcW w:type="dxa" w:w="1134"/>
+            <w:vAlign w:val="center"/>
+            <w:tcMar>
+              <w:top w:w="100" w:type="dxa"/>
+              <w:start w:w="120" w:type="dxa"/>
+              <w:bottom w:w="100" w:type="dxa"/>
+              <w:end w:w="120" w:type="dxa"/>
+            </w:tcMar>
+          </w:tcPr>
+          <w:p>
+            <w:pPr>
+              <w:jc w:val="left"/>
+            </w:pPr>
+            <w:r>
+              <w:rPr>
+                <w:rFonts w:ascii="Arial" w:hAnsi="Arial" w:eastAsia="宋体"/>
+                <w:color w:val="000000"/>
+                <w:sz w:val="18"/>
+              </w:rPr>
+              <w:t>□</w:t>
+            </w:r>
+          </w:p>
+        </w:tc>
+      </w:tr>
+      <w:tr>
+        <w:tc>
+          <w:tcPr>
+            <w:tcW w:type="dxa" w:w="3118"/>
+            <w:shd w:fill="F2F6FA"/>
+            <w:vAlign w:val="center"/>
+            <w:tcMar>
+              <w:top w:w="100" w:type="dxa"/>
+              <w:start w:w="120" w:type="dxa"/>
+              <w:bottom w:w="100" w:type="dxa"/>
+              <w:end w:w="120" w:type="dxa"/>
+            </w:tcMar>
+          </w:tcPr>
+          <w:p>
+            <w:pPr>
+              <w:jc w:val="center"/>
+            </w:pPr>
+            <w:r>
+              <w:rPr>
+                <w:rFonts w:ascii="Arial" w:hAnsi="Arial" w:eastAsia="宋体"/>
+                <w:color w:val="000000"/>
+                <w:sz w:val="18"/>
+              </w:rPr>
+              <w:t>模板生成</w:t>
+            </w:r>
+          </w:p>
+        </w:tc>
+        <w:tc>
+          <w:tcPr>
+            <w:tcW w:type="dxa" w:w="4649"/>
+            <w:shd w:fill="F2F6FA"/>
+            <w:vAlign w:val="center"/>
+            <w:tcMar>
+              <w:top w:w="100" w:type="dxa"/>
+              <w:start w:w="120" w:type="dxa"/>
+              <w:bottom w:w="100" w:type="dxa"/>
+              <w:end w:w="120" w:type="dxa"/>
+            </w:tcMar>
+          </w:tcPr>
+          <w:p>
+            <w:pPr>
+              <w:jc w:val="left"/>
+            </w:pPr>
+            <w:r>
+              <w:rPr>
+                <w:rFonts w:ascii="Arial" w:hAnsi="Arial" w:eastAsia="宋体"/>
+                <w:color w:val="000000"/>
+                <w:sz w:val="18"/>
+              </w:rPr>
+              <w:t>输出正文与完整评估字段</w:t>
+            </w:r>
+          </w:p>
+        </w:tc>
+        <w:tc>
+          <w:tcPr>
+            <w:tcW w:type="dxa" w:w="1134"/>
+            <w:shd w:fill="F2F6FA"/>
+            <w:vAlign w:val="center"/>
+            <w:tcMar>
+              <w:top w:w="100" w:type="dxa"/>
+              <w:start w:w="120" w:type="dxa"/>
+              <w:bottom w:w="100" w:type="dxa"/>
+              <w:end w:w="120" w:type="dxa"/>
+            </w:tcMar>
+          </w:tcPr>
+          <w:p>
+            <w:pPr>
+              <w:jc w:val="left"/>
+            </w:pPr>
+            <w:r>
+              <w:rPr>
+                <w:rFonts w:ascii="Arial" w:hAnsi="Arial" w:eastAsia="宋体"/>
+                <w:color w:val="000000"/>
+                <w:sz w:val="18"/>
+              </w:rPr>
+              <w:t>□</w:t>
+            </w:r>
+          </w:p>
+        </w:tc>
+      </w:tr>
+      <w:tr>
+        <w:tc>
+          <w:tcPr>
+            <w:tcW w:type="dxa" w:w="3118"/>
+            <w:vAlign w:val="center"/>
+            <w:tcMar>
+              <w:top w:w="100" w:type="dxa"/>
+              <w:start w:w="120" w:type="dxa"/>
+              <w:bottom w:w="100" w:type="dxa"/>
+              <w:end w:w="120" w:type="dxa"/>
+            </w:tcMar>
+          </w:tcPr>
+          <w:p>
+            <w:pPr>
+              <w:jc w:val="center"/>
+            </w:pPr>
+            <w:r>
+              <w:rPr>
+                <w:rFonts w:ascii="Arial" w:hAnsi="Arial" w:eastAsia="宋体"/>
+                <w:color w:val="000000"/>
+                <w:sz w:val="18"/>
+              </w:rPr>
+              <w:t>文本评估</w:t>
+            </w:r>
+          </w:p>
+        </w:tc>
+        <w:tc>
+          <w:tcPr>
+            <w:tcW w:type="dxa" w:w="4649"/>
+            <w:vAlign w:val="center"/>
+            <w:tcMar>
+              <w:top w:w="100" w:type="dxa"/>
+              <w:start w:w="120" w:type="dxa"/>
+              <w:bottom w:w="100" w:type="dxa"/>
+              <w:end w:w="120" w:type="dxa"/>
+            </w:tcMar>
+          </w:tcPr>
+          <w:p>
+            <w:pPr>
+              <w:jc w:val="left"/>
+            </w:pPr>
+            <w:r>
+              <w:rPr>
+                <w:rFonts w:ascii="Arial" w:hAnsi="Arial" w:eastAsia="宋体"/>
+                <w:color w:val="000000"/>
+                <w:sz w:val="18"/>
+              </w:rPr>
+              <w:t>JSON 包含统计、分数、警告和建议</w:t>
+            </w:r>
+          </w:p>
+        </w:tc>
+        <w:tc>
+          <w:tcPr>
+            <w:tcW w:type="dxa" w:w="1134"/>
+            <w:vAlign w:val="center"/>
+            <w:tcMar>
+              <w:top w:w="100" w:type="dxa"/>
+              <w:start w:w="120" w:type="dxa"/>
+              <w:bottom w:w="100" w:type="dxa"/>
+              <w:end w:w="120" w:type="dxa"/>
+            </w:tcMar>
+          </w:tcPr>
+          <w:p>
+            <w:pPr>
+              <w:jc w:val="left"/>
+            </w:pPr>
+            <w:r>
+              <w:rPr>
+                <w:rFonts w:ascii="Arial" w:hAnsi="Arial" w:eastAsia="宋体"/>
+                <w:color w:val="000000"/>
+                <w:sz w:val="18"/>
+              </w:rPr>
+              <w:t>□</w:t>
+            </w:r>
+          </w:p>
+        </w:tc>
+      </w:tr>
+      <w:tr>
+        <w:tc>
+          <w:tcPr>
+            <w:tcW w:type="dxa" w:w="3118"/>
+            <w:shd w:fill="F2F6FA"/>
+            <w:vAlign w:val="center"/>
+            <w:tcMar>
+              <w:top w:w="100" w:type="dxa"/>
+              <w:start w:w="120" w:type="dxa"/>
+              <w:bottom w:w="100" w:type="dxa"/>
+              <w:end w:w="120" w:type="dxa"/>
+            </w:tcMar>
+          </w:tcPr>
+          <w:p>
+            <w:pPr>
+              <w:jc w:val="center"/>
+            </w:pPr>
+            <w:r>
+              <w:rPr>
+                <w:rFonts w:ascii="Arial" w:hAnsi="Arial" w:eastAsia="宋体"/>
+                <w:color w:val="000000"/>
+                <w:sz w:val="18"/>
+              </w:rPr>
+              <w:t>批量任务</w:t>
+            </w:r>
+          </w:p>
+        </w:tc>
+        <w:tc>
+          <w:tcPr>
+            <w:tcW w:type="dxa" w:w="4649"/>
+            <w:shd w:fill="F2F6FA"/>
+            <w:vAlign w:val="center"/>
+            <w:tcMar>
+              <w:top w:w="100" w:type="dxa"/>
+              <w:start w:w="120" w:type="dxa"/>
+              <w:bottom w:w="100" w:type="dxa"/>
+              <w:end w:w="120" w:type="dxa"/>
+            </w:tcMar>
+          </w:tcPr>
+          <w:p>
+            <w:pPr>
+              <w:jc w:val="left"/>
+            </w:pPr>
+            <w:r>
+              <w:rPr>
+                <w:rFonts w:ascii="Arial" w:hAnsi="Arial" w:eastAsia="宋体"/>
+                <w:color w:val="000000"/>
+                <w:sz w:val="18"/>
+              </w:rPr>
+              <w:t>正常记录成功项并隔离异常项</w:t>
+            </w:r>
+          </w:p>
+        </w:tc>
+        <w:tc>
+          <w:tcPr>
+            <w:tcW w:type="dxa" w:w="1134"/>
+            <w:shd w:fill="F2F6FA"/>
+            <w:vAlign w:val="center"/>
+            <w:tcMar>
+              <w:top w:w="100" w:type="dxa"/>
+              <w:start w:w="120" w:type="dxa"/>
+              <w:bottom w:w="100" w:type="dxa"/>
+              <w:end w:w="120" w:type="dxa"/>
+            </w:tcMar>
+          </w:tcPr>
+          <w:p>
+            <w:pPr>
+              <w:jc w:val="left"/>
+            </w:pPr>
+            <w:r>
+              <w:rPr>
+                <w:rFonts w:ascii="Arial" w:hAnsi="Arial" w:eastAsia="宋体"/>
+                <w:color w:val="000000"/>
+                <w:sz w:val="18"/>
+              </w:rPr>
+              <w:t>□</w:t>
+            </w:r>
+          </w:p>
+        </w:tc>
+      </w:tr>
+      <w:tr>
+        <w:tc>
+          <w:tcPr>
+            <w:tcW w:type="dxa" w:w="3118"/>
+            <w:vAlign w:val="center"/>
+            <w:tcMar>
+              <w:top w:w="100" w:type="dxa"/>
+              <w:start w:w="120" w:type="dxa"/>
+              <w:bottom w:w="100" w:type="dxa"/>
+              <w:end w:w="120" w:type="dxa"/>
+            </w:tcMar>
+          </w:tcPr>
+          <w:p>
+            <w:pPr>
+              <w:jc w:val="center"/>
+            </w:pPr>
+            <w:r>
+              <w:rPr>
+                <w:rFonts w:ascii="Arial" w:hAnsi="Arial" w:eastAsia="宋体"/>
+                <w:color w:val="000000"/>
+                <w:sz w:val="18"/>
+              </w:rPr>
+              <w:t>报告导出</w:t>
+            </w:r>
+          </w:p>
+        </w:tc>
+        <w:tc>
+          <w:tcPr>
+            <w:tcW w:type="dxa" w:w="4649"/>
+            <w:vAlign w:val="center"/>
+            <w:tcMar>
+              <w:top w:w="100" w:type="dxa"/>
+              <w:start w:w="120" w:type="dxa"/>
+              <w:bottom w:w="100" w:type="dxa"/>
+              <w:end w:w="120" w:type="dxa"/>
+            </w:tcMar>
+          </w:tcPr>
+          <w:p>
+            <w:pPr>
+              <w:jc w:val="left"/>
+            </w:pPr>
+            <w:r>
+              <w:rPr>
+                <w:rFonts w:ascii="Arial" w:hAnsi="Arial" w:eastAsia="宋体"/>
+                <w:color w:val="000000"/>
+                <w:sz w:val="18"/>
+              </w:rPr>
+              <w:t>JSONL、JSON、CSV、HTML 可正常打开</w:t>
+            </w:r>
+          </w:p>
+        </w:tc>
+        <w:tc>
+          <w:tcPr>
+            <w:tcW w:type="dxa" w:w="1134"/>
+            <w:vAlign w:val="center"/>
+            <w:tcMar>
+              <w:top w:w="100" w:type="dxa"/>
+              <w:start w:w="120" w:type="dxa"/>
+              <w:bottom w:w="100" w:type="dxa"/>
+              <w:end w:w="120" w:type="dxa"/>
+            </w:tcMar>
+          </w:tcPr>
+          <w:p>
+            <w:pPr>
+              <w:jc w:val="left"/>
+            </w:pPr>
+            <w:r>
+              <w:rPr>
+                <w:rFonts w:ascii="Arial" w:hAnsi="Arial" w:eastAsia="宋体"/>
+                <w:color w:val="000000"/>
+                <w:sz w:val="18"/>
+              </w:rPr>
+              <w:t>□</w:t>
+            </w:r>
+          </w:p>
+        </w:tc>
+      </w:tr>
+      <w:tr>
+        <w:tc>
+          <w:tcPr>
+            <w:tcW w:type="dxa" w:w="3118"/>
+            <w:shd w:fill="F2F6FA"/>
+            <w:vAlign w:val="center"/>
+            <w:tcMar>
+              <w:top w:w="100" w:type="dxa"/>
+              <w:start w:w="120" w:type="dxa"/>
+              <w:bottom w:w="100" w:type="dxa"/>
+              <w:end w:w="120" w:type="dxa"/>
+            </w:tcMar>
+          </w:tcPr>
+          <w:p>
+            <w:pPr>
+              <w:jc w:val="center"/>
+            </w:pPr>
+            <w:r>
+              <w:rPr>
+                <w:rFonts w:ascii="Arial" w:hAnsi="Arial" w:eastAsia="宋体"/>
+                <w:color w:val="000000"/>
+                <w:sz w:val="18"/>
+              </w:rPr>
+              <w:t>本地模型</w:t>
+            </w:r>
+          </w:p>
+        </w:tc>
+        <w:tc>
+          <w:tcPr>
+            <w:tcW w:type="dxa" w:w="4649"/>
+            <w:shd w:fill="F2F6FA"/>
+            <w:vAlign w:val="center"/>
+            <w:tcMar>
+              <w:top w:w="100" w:type="dxa"/>
+              <w:start w:w="120" w:type="dxa"/>
+              <w:bottom w:w="100" w:type="dxa"/>
+              <w:end w:w="120" w:type="dxa"/>
+            </w:tcMar>
+          </w:tcPr>
+          <w:p>
+            <w:pPr>
+              <w:jc w:val="left"/>
+            </w:pPr>
+            <w:r>
+              <w:rPr>
+                <w:rFonts w:ascii="Arial" w:hAnsi="Arial" w:eastAsia="宋体"/>
+                <w:color w:val="000000"/>
+                <w:sz w:val="18"/>
+              </w:rPr>
+              <w:t>指定 Qwen3 模型能够生成非空正文</w:t>
+            </w:r>
+          </w:p>
+        </w:tc>
+        <w:tc>
+          <w:tcPr>
+            <w:tcW w:type="dxa" w:w="1134"/>
+            <w:shd w:fill="F2F6FA"/>
+            <w:vAlign w:val="center"/>
+            <w:tcMar>
+              <w:top w:w="100" w:type="dxa"/>
+              <w:start w:w="120" w:type="dxa"/>
+              <w:bottom w:w="100" w:type="dxa"/>
+              <w:end w:w="120" w:type="dxa"/>
+            </w:tcMar>
+          </w:tcPr>
+          <w:p>
+            <w:pPr>
+              <w:jc w:val="left"/>
+            </w:pPr>
+            <w:r>
+              <w:rPr>
+                <w:rFonts w:ascii="Arial" w:hAnsi="Arial" w:eastAsia="宋体"/>
+                <w:color w:val="000000"/>
+                <w:sz w:val="18"/>
+              </w:rPr>
+              <w:t>□</w:t>
+            </w:r>
+          </w:p>
+        </w:tc>
+      </w:tr>
+      <w:tr>
+        <w:tc>
+          <w:tcPr>
+            <w:tcW w:type="dxa" w:w="3118"/>
+            <w:vAlign w:val="center"/>
+            <w:tcMar>
+              <w:top w:w="100" w:type="dxa"/>
+              <w:start w:w="120" w:type="dxa"/>
+              <w:bottom w:w="100" w:type="dxa"/>
+              <w:end w:w="120" w:type="dxa"/>
+            </w:tcMar>
+          </w:tcPr>
+          <w:p>
+            <w:pPr>
+              <w:jc w:val="center"/>
+            </w:pPr>
+            <w:r>
+              <w:rPr>
+                <w:rFonts w:ascii="Arial" w:hAnsi="Arial" w:eastAsia="宋体"/>
+                <w:color w:val="000000"/>
+                <w:sz w:val="18"/>
+              </w:rPr>
+              <w:t>LoRA 训练</w:t>
+            </w:r>
+          </w:p>
+        </w:tc>
+        <w:tc>
+          <w:tcPr>
+            <w:tcW w:type="dxa" w:w="4649"/>
+            <w:vAlign w:val="center"/>
+            <w:tcMar>
+              <w:top w:w="100" w:type="dxa"/>
+              <w:start w:w="120" w:type="dxa"/>
+              <w:bottom w:w="100" w:type="dxa"/>
+              <w:end w:w="120" w:type="dxa"/>
+            </w:tcMar>
+          </w:tcPr>
+          <w:p>
+            <w:pPr>
+              <w:jc w:val="left"/>
+            </w:pPr>
+            <w:r>
+              <w:rPr>
+                <w:rFonts w:ascii="Arial" w:hAnsi="Arial" w:eastAsia="宋体"/>
+                <w:color w:val="000000"/>
+                <w:sz w:val="18"/>
+              </w:rPr>
+              <w:t>适配器配置与权重成功保存</w:t>
+            </w:r>
+          </w:p>
+        </w:tc>
+        <w:tc>
+          <w:tcPr>
+            <w:tcW w:type="dxa" w:w="1134"/>
+            <w:vAlign w:val="center"/>
+            <w:tcMar>
+              <w:top w:w="100" w:type="dxa"/>
+              <w:start w:w="120" w:type="dxa"/>
+              <w:bottom w:w="100" w:type="dxa"/>
+              <w:end w:w="120" w:type="dxa"/>
+            </w:tcMar>
+          </w:tcPr>
+          <w:p>
+            <w:pPr>
+              <w:jc w:val="left"/>
+            </w:pPr>
+            <w:r>
+              <w:rPr>
+                <w:rFonts w:ascii="Arial" w:hAnsi="Arial" w:eastAsia="宋体"/>
+                <w:color w:val="000000"/>
+                <w:sz w:val="18"/>
+              </w:rPr>
+              <w:t>□</w:t>
+            </w:r>
+          </w:p>
+        </w:tc>
+      </w:tr>
+      <w:tr>
+        <w:tc>
+          <w:tcPr>
+            <w:tcW w:type="dxa" w:w="3118"/>
+            <w:shd w:fill="F2F6FA"/>
+            <w:vAlign w:val="center"/>
+            <w:tcMar>
+              <w:top w:w="100" w:type="dxa"/>
+              <w:start w:w="120" w:type="dxa"/>
+              <w:bottom w:w="100" w:type="dxa"/>
+              <w:end w:w="120" w:type="dxa"/>
+            </w:tcMar>
+          </w:tcPr>
+          <w:p>
+            <w:pPr>
+              <w:jc w:val="center"/>
+            </w:pPr>
+            <w:r>
+              <w:rPr>
+                <w:rFonts w:ascii="Arial" w:hAnsi="Arial" w:eastAsia="宋体"/>
+                <w:color w:val="000000"/>
+                <w:sz w:val="18"/>
+              </w:rPr>
+              <w:t>LoRA 推理</w:t>
+            </w:r>
+          </w:p>
+        </w:tc>
+        <w:tc>
+          <w:tcPr>
+            <w:tcW w:type="dxa" w:w="4649"/>
+            <w:shd w:fill="F2F6FA"/>
+            <w:vAlign w:val="center"/>
+            <w:tcMar>
+              <w:top w:w="100" w:type="dxa"/>
+              <w:start w:w="120" w:type="dxa"/>
+              <w:bottom w:w="100" w:type="dxa"/>
+              <w:end w:w="120" w:type="dxa"/>
+            </w:tcMar>
+          </w:tcPr>
+          <w:p>
+            <w:pPr>
+              <w:jc w:val="left"/>
+            </w:pPr>
+            <w:r>
+              <w:rPr>
+                <w:rFonts w:ascii="Arial" w:hAnsi="Arial" w:eastAsia="宋体"/>
+                <w:color w:val="000000"/>
+                <w:sz w:val="18"/>
+              </w:rPr>
+              <w:t>--lora-path 加载成功并生成正文</w:t>
+            </w:r>
+          </w:p>
+        </w:tc>
+        <w:tc>
+          <w:tcPr>
+            <w:tcW w:type="dxa" w:w="1134"/>
+            <w:shd w:fill="F2F6FA"/>
+            <w:vAlign w:val="center"/>
+            <w:tcMar>
+              <w:top w:w="100" w:type="dxa"/>
+              <w:start w:w="120" w:type="dxa"/>
+              <w:bottom w:w="100" w:type="dxa"/>
+              <w:end w:w="120" w:type="dxa"/>
+            </w:tcMar>
+          </w:tcPr>
+          <w:p>
+            <w:pPr>
+              <w:jc w:val="left"/>
+            </w:pPr>
+            <w:r>
+              <w:rPr>
+                <w:rFonts w:ascii="Arial" w:hAnsi="Arial" w:eastAsia="宋体"/>
+                <w:color w:val="000000"/>
+                <w:sz w:val="18"/>
+              </w:rPr>
+              <w:t>□</w:t>
+            </w:r>
+          </w:p>
+        </w:tc>
+      </w:tr>
+      <w:tr>
+        <w:tc>
+          <w:tcPr>
+            <w:tcW w:type="dxa" w:w="3118"/>
+            <w:vAlign w:val="center"/>
+            <w:tcMar>
+              <w:top w:w="100" w:type="dxa"/>
+              <w:start w:w="120" w:type="dxa"/>
+              <w:bottom w:w="100" w:type="dxa"/>
+              <w:end w:w="120" w:type="dxa"/>
+            </w:tcMar>
+          </w:tcPr>
+          <w:p>
+            <w:pPr>
+              <w:jc w:val="center"/>
+            </w:pPr>
+            <w:r>
+              <w:rPr>
+                <w:rFonts w:ascii="Arial" w:hAnsi="Arial" w:eastAsia="宋体"/>
+                <w:color w:val="000000"/>
+                <w:sz w:val="18"/>
+              </w:rPr>
+              <w:t>一键测试</w:t>
+            </w:r>
+          </w:p>
+        </w:tc>
+        <w:tc>
+          <w:tcPr>
+            <w:tcW w:type="dxa" w:w="4649"/>
+            <w:vAlign w:val="center"/>
+            <w:tcMar>
+              <w:top w:w="100" w:type="dxa"/>
+              <w:start w:w="120" w:type="dxa"/>
+              <w:bottom w:w="100" w:type="dxa"/>
+              <w:end w:w="120" w:type="dxa"/>
+            </w:tcMar>
+          </w:tcPr>
+          <w:p>
+            <w:pPr>
+              <w:jc w:val="left"/>
+            </w:pPr>
+            <w:r>
+              <w:rPr>
+                <w:rFonts w:ascii="Arial" w:hAnsi="Arial" w:eastAsia="宋体"/>
+                <w:color w:val="000000"/>
+                <w:sz w:val="18"/>
+              </w:rPr>
+              <w:t>test_summary.json 中所有项目为 PASS</w:t>
+            </w:r>
+          </w:p>
+        </w:tc>
+        <w:tc>
+          <w:tcPr>
+            <w:tcW w:type="dxa" w:w="1134"/>
+            <w:vAlign w:val="center"/>
+            <w:tcMar>
+              <w:top w:w="100" w:type="dxa"/>
+              <w:start w:w="120" w:type="dxa"/>
+              <w:bottom w:w="100" w:type="dxa"/>
+              <w:end w:w="120" w:type="dxa"/>
+            </w:tcMar>
+          </w:tcPr>
+          <w:p>
+            <w:pPr>
+              <w:jc w:val="left"/>
+            </w:pPr>
+            <w:r>
+              <w:rPr>
+                <w:rFonts w:ascii="Arial" w:hAnsi="Arial" w:eastAsia="宋体"/>
+                <w:color w:val="000000"/>
+                <w:sz w:val="18"/>
+              </w:rPr>
+              <w:t>□</w:t>
+            </w:r>
+          </w:p>
+        </w:tc>
+      </w:tr>
+      <w:tr>
+        <w:tc>
+          <w:tcPr>
+            <w:tcW w:type="dxa" w:w="3118"/>
+            <w:shd w:fill="F2F6FA"/>
+            <w:vAlign w:val="center"/>
+            <w:tcMar>
+              <w:top w:w="100" w:type="dxa"/>
+              <w:start w:w="120" w:type="dxa"/>
+              <w:bottom w:w="100" w:type="dxa"/>
+              <w:end w:w="120" w:type="dxa"/>
+            </w:tcMar>
+          </w:tcPr>
+          <w:p>
+            <w:pPr>
+              <w:jc w:val="center"/>
+            </w:pPr>
+            <w:r>
+              <w:rPr>
+                <w:rFonts w:ascii="Arial" w:hAnsi="Arial" w:eastAsia="宋体"/>
+                <w:color w:val="000000"/>
+                <w:sz w:val="18"/>
+              </w:rPr>
+              <w:t>Notebook</w:t>
+            </w:r>
+          </w:p>
+        </w:tc>
+        <w:tc>
+          <w:tcPr>
+            <w:tcW w:type="dxa" w:w="4649"/>
+            <w:shd w:fill="F2F6FA"/>
+            <w:vAlign w:val="center"/>
+            <w:tcMar>
+              <w:top w:w="100" w:type="dxa"/>
+              <w:start w:w="120" w:type="dxa"/>
+              <w:bottom w:w="100" w:type="dxa"/>
+              <w:end w:w="120" w:type="dxa"/>
+            </w:tcMar>
+          </w:tcPr>
+          <w:p>
+            <w:pPr>
+              <w:jc w:val="left"/>
+            </w:pPr>
+            <w:r>
+              <w:rPr>
+                <w:rFonts w:ascii="Arial" w:hAnsi="Arial" w:eastAsia="宋体"/>
+                <w:color w:val="000000"/>
+                <w:sz w:val="18"/>
+              </w:rPr>
+              <w:t>各批次单元按顺序执行通过</w:t>
+            </w:r>
+          </w:p>
+        </w:tc>
+        <w:tc>
+          <w:tcPr>
+            <w:tcW w:type="dxa" w:w="1134"/>
+            <w:shd w:fill="F2F6FA"/>
+            <w:vAlign w:val="center"/>
+            <w:tcMar>
+              <w:top w:w="100" w:type="dxa"/>
+              <w:start w:w="120" w:type="dxa"/>
+              <w:bottom w:w="100" w:type="dxa"/>
+              <w:end w:w="120" w:type="dxa"/>
+            </w:tcMar>
+          </w:tcPr>
+          <w:p>
+            <w:pPr>
+              <w:jc w:val="left"/>
+            </w:pPr>
+            <w:r>
+              <w:rPr>
+                <w:rFonts w:ascii="Arial" w:hAnsi="Arial" w:eastAsia="宋体"/>
+                <w:color w:val="000000"/>
+                <w:sz w:val="18"/>
+              </w:rPr>
+              <w:t>□</w:t>
+            </w:r>
+          </w:p>
+        </w:tc>
+      </w:tr>
+    </w:tbl>
+    <w:p/>
     <w:sectPr>
       <w:footerReference w:type="default" r:id="rId9"/>
       <w:pgSz w:w="12240" w:h="15840"/>

</xml_diff>